<commit_message>
Update cognitive predictors paper and materials
</commit_message>
<xml_diff>
--- a/paper_2_plasticity/paper_2_neuroplasticity.docx
+++ b/paper_2_plasticity/paper_2_neuroplasticity.docx
@@ -2235,7 +2235,7 @@
       </w:r>
     </w:p>
     <w:bookmarkEnd w:id="50"/>
-    <w:bookmarkStart w:id="65" w:name="method"/>
+    <w:bookmarkStart w:id="73" w:name="method"/>
     <w:p>
       <w:pPr>
         <w:pStyle w:val="Heading1"/>
@@ -2730,7 +2730,7 @@
       </w:r>
     </w:p>
     <w:bookmarkEnd w:id="55"/>
-    <w:bookmarkStart w:id="56" w:name="cognitive-and-neural-indices"/>
+    <w:bookmarkStart w:id="64" w:name="cognitive-and-neural-indices"/>
     <w:p>
       <w:pPr>
         <w:pStyle w:val="Heading2"/>
@@ -2967,7 +2967,13 @@
         <w:t xml:space="preserve"> </w:t>
       </w:r>
       <w:r>
-        <w:t xml:space="preserve">minutes each. Preprocessing in BrainVision Analyzer comprised visual inspection,</w:t>
+        <w:t xml:space="preserve">minutes each, whose order was counterbalanced between participants. Preprocessing in</w:t>
+      </w:r>
+      <w:r>
+        <w:t xml:space="preserve"> </w:t>
+      </w:r>
+      <w:r>
+        <w:t xml:space="preserve">BrainVision Analyzer comprised visual inspection,</w:t>
       </w:r>
       <w:r>
         <w:t xml:space="preserve"> </w:t>
@@ -2991,7 +2997,31 @@
         <w:t xml:space="preserve"> </w:t>
       </w:r>
       <w:r>
-        <w:t xml:space="preserve">preprocessing details are given in the online supplementary material (Section S2). Power</w:t>
+        <w:t xml:space="preserve">preprocessing details are given in the online supplementary material (Section S2). Across</w:t>
+      </w:r>
+      <w:r>
+        <w:t xml:space="preserve"> </w:t>
+      </w:r>
+      <w:r>
+        <w:t xml:space="preserve">the laboratory sessions, participants were instructed to minimise movement and blinking,</w:t>
+      </w:r>
+      <w:r>
+        <w:t xml:space="preserve"> </w:t>
+      </w:r>
+      <w:r>
+        <w:t xml:space="preserve">especially during the presentation of words. During pauses in these long sessions,</w:t>
+      </w:r>
+      <w:r>
+        <w:t xml:space="preserve"> </w:t>
+      </w:r>
+      <w:r>
+        <w:t xml:space="preserve">experimenters monitored the signal and intervened when necessary to maintain low electrode</w:t>
+      </w:r>
+      <w:r>
+        <w:t xml:space="preserve"> </w:t>
+      </w:r>
+      <w:r>
+        <w:t xml:space="preserve">impedance and acceptable signal quality. Power</w:t>
       </w:r>
       <w:r>
         <w:t xml:space="preserve"> </w:t>
@@ -3402,8 +3432,243 @@
         <w:t xml:space="preserve">fitted one.</w:t>
       </w:r>
     </w:p>
-    <w:bookmarkEnd w:id="56"/>
-    <w:bookmarkStart w:id="57" w:name="X7b3fd7d6f249e10b7f8c6d374621584384c8ffe"/>
+    <w:p>
+      <w:pPr>
+        <w:pStyle w:val="BodyText"/>
+      </w:pPr>
+      <w:r>
+        <w:t xml:space="preserve">The observed elapsed duration of each home task and of each phase of the laboratory</w:t>
+      </w:r>
+      <w:r>
+        <w:t xml:space="preserve"> </w:t>
+      </w:r>
+      <w:r>
+        <w:t xml:space="preserve">sessions is shown in</w:t>
+      </w:r>
+      <w:r>
+        <w:t xml:space="preserve"> </w:t>
+      </w:r>
+      <w:hyperlink w:anchor="fig-home-task-duration">
+        <w:r>
+          <w:rPr>
+            <w:rStyle w:val="Hyperlink"/>
+          </w:rPr>
+          <w:t xml:space="preserve">Figure 2</w:t>
+        </w:r>
+      </w:hyperlink>
+      <w:r>
+        <w:t xml:space="preserve"> </w:t>
+      </w:r>
+      <w:r>
+        <w:t xml:space="preserve">and</w:t>
+      </w:r>
+      <w:r>
+        <w:t xml:space="preserve"> </w:t>
+      </w:r>
+      <w:hyperlink w:anchor="fig-lab-phase-duration">
+        <w:r>
+          <w:rPr>
+            <w:rStyle w:val="Hyperlink"/>
+          </w:rPr>
+          <w:t xml:space="preserve">Figure 3</w:t>
+        </w:r>
+      </w:hyperlink>
+      <w:r>
+        <w:t xml:space="preserve">. These are</w:t>
+      </w:r>
+      <w:r>
+        <w:t xml:space="preserve"> </w:t>
+      </w:r>
+      <w:r>
+        <w:t xml:space="preserve">descriptive timing checks, not additional outcomes: home-task duration runs from the</w:t>
+      </w:r>
+      <w:r>
+        <w:t xml:space="preserve"> </w:t>
+      </w:r>
+      <w:r>
+        <w:t xml:space="preserve">first to the last Gorilla event for each participant and task, whereas lab-phase duration</w:t>
+      </w:r>
+      <w:r>
+        <w:t xml:space="preserve"> </w:t>
+      </w:r>
+      <w:r>
+        <w:t xml:space="preserve">uses the OpenSesame phase markers and the final event in a phase when the next phase was</w:t>
+      </w:r>
+      <w:r>
+        <w:t xml:space="preserve"> </w:t>
+      </w:r>
+      <w:r>
+        <w:t xml:space="preserve">recorded in a separate export.</w:t>
+      </w:r>
+      <w:r>
+        <w:t xml:space="preserve"> </w:t>
+      </w:r>
+      <w:r>
+        <w:t xml:space="preserve">The median home-task durations were 4.45 min for Stroop, 11.98 min for digit span and 36.94 min for ASRT in Session 1, and 3.71, 11.32 and 35.61 min, respectively, in Session 5. Median laboratory-phase durations (pretraining, training, test and experiment) were 4.21, 16.14, 9.93 and 47.49 min in Session 2; 1.57, 18.97, 7.18 and 52.54 min in Session 3; 16.73, 20.08 and 78.37 min for training, test and experiment in Session 4, where pretraining was not recorded; and 73.42 min for the experiment in Session 6, where the other phases were not recorded.</w:t>
+      </w:r>
+    </w:p>
+    <w:bookmarkStart w:id="59" w:name="fig-home-task-duration"/>
+    <w:p>
+      <w:pPr>
+        <w:pStyle w:val="FigureTitle"/>
+      </w:pPr>
+      <w:r>
+        <w:t xml:space="preserve">Figure 2</w:t>
+      </w:r>
+    </w:p>
+    <w:p>
+      <w:pPr>
+        <w:pStyle w:val="Caption"/>
+      </w:pPr>
+      <w:r>
+        <w:t xml:space="preserve">Duration of the Home Cognitive Tasks by Session</w:t>
+      </w:r>
+    </w:p>
+    <w:p>
+      <w:pPr>
+        <w:pStyle w:val="FigureWithNote"/>
+      </w:pPr>
+      <w:r>
+        <w:drawing>
+          <wp:inline>
+            <wp:extent cx="5943600" cy="2651759"/>
+            <wp:effectExtent b="0" l="0" r="0" t="0"/>
+            <wp:docPr descr="" title="" id="57" name="Picture"/>
+            <a:graphic>
+              <a:graphicData uri="http://schemas.openxmlformats.org/drawingml/2006/picture">
+                <pic:pic>
+                  <pic:nvPicPr>
+                    <pic:cNvPr descr="paper_2_neuroplasticity_files/figure-docx/fig-home-task-duration-1.png" id="58" name="Picture"/>
+                    <pic:cNvPicPr>
+                      <a:picLocks noChangeArrowheads="1" noChangeAspect="1"/>
+                    </pic:cNvPicPr>
+                  </pic:nvPicPr>
+                  <pic:blipFill>
+                    <a:blip r:embed="rId56"/>
+                    <a:stretch>
+                      <a:fillRect/>
+                    </a:stretch>
+                  </pic:blipFill>
+                  <pic:spPr bwMode="auto">
+                    <a:xfrm>
+                      <a:off x="0" y="0"/>
+                      <a:ext cx="5943600" cy="2651759"/>
+                    </a:xfrm>
+                    <a:prstGeom prst="rect">
+                      <a:avLst/>
+                    </a:prstGeom>
+                    <a:noFill/>
+                    <a:ln w="9525">
+                      <a:noFill/>
+                      <a:headEnd/>
+                      <a:tailEnd/>
+                    </a:ln>
+                  </pic:spPr>
+                </pic:pic>
+              </a:graphicData>
+            </a:graphic>
+          </wp:inline>
+        </w:drawing>
+      </w:r>
+    </w:p>
+    <w:bookmarkEnd w:id="59"/>
+    <w:p>
+      <w:pPr>
+        <w:pStyle w:val="FigureNote"/>
+      </w:pPr>
+      <w:r>
+        <w:rPr>
+          <w:i/>
+          <w:iCs/>
+        </w:rPr>
+        <w:t xml:space="preserve">Note</w:t>
+      </w:r>
+      <w:r>
+        <w:t xml:space="preserve">. Each box summarises the distribution across participants of elapsed time from the first to the last raw Gorilla event for one task and session; the centre line is the median, the box spans the interquartile range, and whiskers extend to 1.5 times the interquartile range. Sessions 1 and 5 are baseline and post-training, respectively. Durations therefore include instructions, practice and test material when those events are present in the export. The ordinate is logarithmic because five exports contain multi-hour idle gaps; those observations remain as outliers. Participants without a linked enrolled-participant key are excluded.</w:t>
+      </w:r>
+    </w:p>
+    <w:bookmarkStart w:id="63" w:name="fig-lab-phase-duration"/>
+    <w:p>
+      <w:pPr>
+        <w:pStyle w:val="FigureTitle"/>
+      </w:pPr>
+      <w:r>
+        <w:t xml:space="preserve">Figure 3</w:t>
+      </w:r>
+    </w:p>
+    <w:p>
+      <w:pPr>
+        <w:pStyle w:val="Caption"/>
+      </w:pPr>
+      <w:r>
+        <w:t xml:space="preserve">Duration of the Laboratory-Session Phases</w:t>
+      </w:r>
+    </w:p>
+    <w:p>
+      <w:pPr>
+        <w:pStyle w:val="FigureWithNote"/>
+      </w:pPr>
+      <w:r>
+        <w:drawing>
+          <wp:inline>
+            <wp:extent cx="5943600" cy="2743199"/>
+            <wp:effectExtent b="0" l="0" r="0" t="0"/>
+            <wp:docPr descr="" title="" id="61" name="Picture"/>
+            <a:graphic>
+              <a:graphicData uri="http://schemas.openxmlformats.org/drawingml/2006/picture">
+                <pic:pic>
+                  <pic:nvPicPr>
+                    <pic:cNvPr descr="paper_2_neuroplasticity_files/figure-docx/fig-lab-phase-duration-1.png" id="62" name="Picture"/>
+                    <pic:cNvPicPr>
+                      <a:picLocks noChangeArrowheads="1" noChangeAspect="1"/>
+                    </pic:cNvPicPr>
+                  </pic:nvPicPr>
+                  <pic:blipFill>
+                    <a:blip r:embed="rId60"/>
+                    <a:stretch>
+                      <a:fillRect/>
+                    </a:stretch>
+                  </pic:blipFill>
+                  <pic:spPr bwMode="auto">
+                    <a:xfrm>
+                      <a:off x="0" y="0"/>
+                      <a:ext cx="5943600" cy="2743199"/>
+                    </a:xfrm>
+                    <a:prstGeom prst="rect">
+                      <a:avLst/>
+                    </a:prstGeom>
+                    <a:noFill/>
+                    <a:ln w="9525">
+                      <a:noFill/>
+                      <a:headEnd/>
+                      <a:tailEnd/>
+                    </a:ln>
+                  </pic:spPr>
+                </pic:pic>
+              </a:graphicData>
+            </a:graphic>
+          </wp:inline>
+        </w:drawing>
+      </w:r>
+    </w:p>
+    <w:bookmarkEnd w:id="63"/>
+    <w:p>
+      <w:pPr>
+        <w:pStyle w:val="FigureNote"/>
+      </w:pPr>
+      <w:r>
+        <w:rPr>
+          <w:i/>
+          <w:iCs/>
+        </w:rPr>
+        <w:t xml:space="preserve">Note</w:t>
+      </w:r>
+      <w:r>
+        <w:t xml:space="preserve">. Each box summarises the distribution across participants of elapsed time in one laboratory-session phase and session; the centre line is the median, the box spans the interquartile range, and whiskers extend to 1.5 times the interquartile range. Phase duration is measured between the recorded phase-start markers, or from a phase start to the last phase-specific event when the next phase was exported separately. Sessions 2, 3 and 4 are training sessions and Session 6 is the retention session.</w:t>
+      </w:r>
+    </w:p>
+    <w:bookmarkEnd w:id="64"/>
+    <w:bookmarkStart w:id="65" w:name="X7b3fd7d6f249e10b7f8c6d374621584384c8ffe"/>
     <w:p>
       <w:pPr>
         <w:pStyle w:val="Heading2"/>
@@ -4040,7 +4305,7 @@
           <w:rPr>
             <w:rStyle w:val="Hyperlink"/>
           </w:rPr>
-          <w:t xml:space="preserve">Figure 2</w:t>
+          <w:t xml:space="preserve">Figure 4</w:t>
         </w:r>
       </w:hyperlink>
       <w:r>
@@ -4349,8 +4614,8 @@
         <w:t xml:space="preserve">model its companion.</w:t>
       </w:r>
     </w:p>
-    <w:bookmarkEnd w:id="57"/>
-    <w:bookmarkStart w:id="58" w:name="Xb4794e3a175eace7b95b5dc107cbd8c69d362e5"/>
+    <w:bookmarkEnd w:id="65"/>
+    <w:bookmarkStart w:id="66" w:name="Xb4794e3a175eace7b95b5dc107cbd8c69d362e5"/>
     <w:p>
       <w:pPr>
         <w:pStyle w:val="Heading2"/>
@@ -4490,8 +4755,8 @@
         <w:t xml:space="preserve">EEG was recorded only at baseline, no neural pre/post is estimated.</w:t>
       </w:r>
     </w:p>
-    <w:bookmarkEnd w:id="58"/>
-    <w:bookmarkStart w:id="59" w:name="priors"/>
+    <w:bookmarkEnd w:id="66"/>
+    <w:bookmarkStart w:id="67" w:name="priors"/>
     <w:p>
       <w:pPr>
         <w:pStyle w:val="Heading2"/>
@@ -5063,8 +5328,8 @@
         <w:t xml:space="preserve">supplementary material (Section S6).</w:t>
       </w:r>
     </w:p>
-    <w:bookmarkEnd w:id="59"/>
-    <w:bookmarkStart w:id="61" w:name="sampler-diagnostics-and-inference"/>
+    <w:bookmarkEnd w:id="67"/>
+    <w:bookmarkStart w:id="69" w:name="sampler-diagnostics-and-inference"/>
     <w:p>
       <w:pPr>
         <w:pStyle w:val="Heading2"/>
@@ -5618,7 +5883,7 @@
       <w:r>
         <w:t xml:space="preserve">(</w:t>
       </w:r>
-      <w:hyperlink r:id="rId60">
+      <w:hyperlink r:id="rId68">
         <w:r>
           <w:rPr>
             <w:rStyle w:val="Hyperlink"/>
@@ -5648,8 +5913,8 @@
         <w:t xml:space="preserve">reproduces the analyses without the tool.</w:t>
       </w:r>
     </w:p>
-    <w:bookmarkEnd w:id="61"/>
-    <w:bookmarkStart w:id="62" w:name="X86a843115a3863fa8d435e2432715bd77dba8f0"/>
+    <w:bookmarkEnd w:id="69"/>
+    <w:bookmarkStart w:id="70" w:name="X86a843115a3863fa8d435e2432715bd77dba8f0"/>
     <w:p>
       <w:pPr>
         <w:pStyle w:val="Heading2"/>
@@ -6281,8 +6546,8 @@
         <w:t xml:space="preserve">reference models’ selections are reported side by side.</w:t>
       </w:r>
     </w:p>
-    <w:bookmarkEnd w:id="62"/>
-    <w:bookmarkStart w:id="64" w:name="transparency-and-preregistration"/>
+    <w:bookmarkEnd w:id="70"/>
+    <w:bookmarkStart w:id="72" w:name="transparency-and-preregistration"/>
     <w:p>
       <w:pPr>
         <w:pStyle w:val="Heading2"/>
@@ -6304,7 +6569,7 @@
       <w:r>
         <w:t xml:space="preserve">collection (</w:t>
       </w:r>
-      <w:hyperlink r:id="rId63">
+      <w:hyperlink r:id="rId71">
         <w:r>
           <w:rPr>
             <w:rStyle w:val="Hyperlink"/>
@@ -6413,24 +6678,54 @@
         <w:t xml:space="preserve"> </w:t>
       </w:r>
       <w:r>
-        <w:t xml:space="preserve">each grammar session (with a second attempt allowed) before they could proceed, a gate</w:t>
-      </w:r>
-      <w:r>
-        <w:t xml:space="preserve"> </w:t>
-      </w:r>
-      <w:r>
-        <w:t xml:space="preserve">that shapes which participant-sessions contribute learning data and is part of the</w:t>
-      </w:r>
-      <w:r>
-        <w:t xml:space="preserve"> </w:t>
-      </w:r>
-      <w:r>
-        <w:t xml:space="preserve">attrition described above.</w:t>
-      </w:r>
-    </w:p>
-    <w:bookmarkEnd w:id="64"/>
-    <w:bookmarkEnd w:id="65"/>
-    <w:bookmarkStart w:id="87" w:name="results"/>
+        <w:t xml:space="preserve">each grammar session before they could proceed. After a few participants had been tested,</w:t>
+      </w:r>
+      <w:r>
+        <w:t xml:space="preserve"> </w:t>
+      </w:r>
+      <w:r>
+        <w:t xml:space="preserve">we recognised that this criterion was too strict and modified the procedure: when the</w:t>
+      </w:r>
+      <w:r>
+        <w:t xml:space="preserve"> </w:t>
+      </w:r>
+      <w:r>
+        <w:t xml:space="preserve">first test score was below 80%, pretraining, training and the test were repeated; after</w:t>
+      </w:r>
+      <w:r>
+        <w:t xml:space="preserve"> </w:t>
+      </w:r>
+      <w:r>
+        <w:t xml:space="preserve">the second attempt, participants proceeded to the experiment regardless of their score.</w:t>
+      </w:r>
+      <w:r>
+        <w:t xml:space="preserve"> </w:t>
+      </w:r>
+      <w:r>
+        <w:t xml:space="preserve">Participants were shown their percentage correct at the end of each test attempt. The 80%</w:t>
+      </w:r>
+      <w:r>
+        <w:t xml:space="preserve"> </w:t>
+      </w:r>
+      <w:r>
+        <w:t xml:space="preserve">threshold therefore describes the first-attempt gate, not a requirement imposed on the</w:t>
+      </w:r>
+      <w:r>
+        <w:t xml:space="preserve"> </w:t>
+      </w:r>
+      <w:r>
+        <w:t xml:space="preserve">second attempt. The gate shapes which participant-sessions contribute learning data and</w:t>
+      </w:r>
+      <w:r>
+        <w:t xml:space="preserve"> </w:t>
+      </w:r>
+      <w:r>
+        <w:t xml:space="preserve">is part of the attrition described above.</w:t>
+      </w:r>
+    </w:p>
+    <w:bookmarkEnd w:id="72"/>
+    <w:bookmarkEnd w:id="73"/>
+    <w:bookmarkStart w:id="95" w:name="results"/>
     <w:p>
       <w:pPr>
         <w:pStyle w:val="Heading1"/>
@@ -6482,7 +6777,7 @@
         <w:t xml:space="preserve">below 1.01, effective sample sizes above 400 in both the bulk and the tail, and no divergent transitions.</w:t>
       </w:r>
     </w:p>
-    <w:bookmarkStart w:id="75" w:name="descriptive-overview"/>
+    <w:bookmarkStart w:id="83" w:name="descriptive-overview"/>
     <w:p>
       <w:pPr>
         <w:pStyle w:val="Heading2"/>
@@ -6506,7 +6801,7 @@
           <w:rPr>
             <w:rStyle w:val="Hyperlink"/>
           </w:rPr>
-          <w:t xml:space="preserve">Figure 2</w:t>
+          <w:t xml:space="preserve">Figure 4</w:t>
         </w:r>
       </w:hyperlink>
       <w:r>
@@ -6529,7 +6824,7 @@
           <w:rPr>
             <w:rStyle w:val="Hyperlink"/>
           </w:rPr>
-          <w:t xml:space="preserve">Figure 3</w:t>
+          <w:t xml:space="preserve">Figure 5</w:t>
         </w:r>
       </w:hyperlink>
       <w:r>
@@ -7130,13 +7425,13 @@
         <w:t xml:space="preserve">trajectory runs.</w:t>
       </w:r>
     </w:p>
-    <w:bookmarkStart w:id="69" w:name="fig-accuracy-trajectory"/>
+    <w:bookmarkStart w:id="77" w:name="fig-accuracy-trajectory"/>
     <w:p>
       <w:pPr>
         <w:pStyle w:val="FigureTitle"/>
       </w:pPr>
       <w:r>
-        <w:t xml:space="preserve">Figure 2</w:t>
+        <w:t xml:space="preserve">Figure 4</w:t>
       </w:r>
     </w:p>
     <w:p>
@@ -7156,18 +7451,18 @@
           <wp:inline>
             <wp:extent cx="5943600" cy="3108959"/>
             <wp:effectExtent b="0" l="0" r="0" t="0"/>
-            <wp:docPr descr="" title="" id="67" name="Picture"/>
+            <wp:docPr descr="" title="" id="75" name="Picture"/>
             <a:graphic>
               <a:graphicData uri="http://schemas.openxmlformats.org/drawingml/2006/picture">
                 <pic:pic>
                   <pic:nvPicPr>
-                    <pic:cNvPr descr="paper_2_neuroplasticity_files/figure-docx/fig-accuracy-trajectory-1.png" id="68" name="Picture"/>
+                    <pic:cNvPr descr="paper_2_neuroplasticity_files/figure-docx/fig-accuracy-trajectory-1.png" id="76" name="Picture"/>
                     <pic:cNvPicPr>
                       <a:picLocks noChangeArrowheads="1" noChangeAspect="1"/>
                     </pic:cNvPicPr>
                   </pic:nvPicPr>
                   <pic:blipFill>
-                    <a:blip r:embed="rId66"/>
+                    <a:blip r:embed="rId74"/>
                     <a:stretch>
                       <a:fillRect/>
                     </a:stretch>
@@ -7194,7 +7489,7 @@
         </w:drawing>
       </w:r>
     </w:p>
-    <w:bookmarkEnd w:id="69"/>
+    <w:bookmarkEnd w:id="77"/>
     <w:p>
       <w:pPr>
         <w:pStyle w:val="FigureNote"/>
@@ -7210,13 +7505,13 @@
         <w:t xml:space="preserve">. Thin lines are individual participants, and the ribbon is a 95% confidence interval computed between participants, the sampling unit being participants and not trials. This is the raw trajectory the joint model summarises, and the direct check on the linear-in-session assumption. No judgements were collected at Session 5. The segment from Session 4 to Session 6 spans the unrehearsed retention interval of about four months, whereas Sessions 2 to 4 were one week apart, so the axis is not proportional to elapsed time.</w:t>
       </w:r>
     </w:p>
-    <w:bookmarkStart w:id="73" w:name="fig-predictor-corr"/>
+    <w:bookmarkStart w:id="81" w:name="fig-predictor-corr"/>
     <w:p>
       <w:pPr>
         <w:pStyle w:val="FigureTitle"/>
       </w:pPr>
       <w:r>
-        <w:t xml:space="preserve">Figure 3</w:t>
+        <w:t xml:space="preserve">Figure 5</w:t>
       </w:r>
     </w:p>
     <w:p>
@@ -7236,18 +7531,18 @@
           <wp:inline>
             <wp:extent cx="5129188" cy="4579632"/>
             <wp:effectExtent b="0" l="0" r="0" t="0"/>
-            <wp:docPr descr="" title="" id="71" name="Picture"/>
+            <wp:docPr descr="" title="" id="79" name="Picture"/>
             <a:graphic>
               <a:graphicData uri="http://schemas.openxmlformats.org/drawingml/2006/picture">
                 <pic:pic>
                   <pic:nvPicPr>
-                    <pic:cNvPr descr="paper_2_neuroplasticity_files/figure-docx/fig-predictor-corr-1.png" id="72" name="Picture"/>
+                    <pic:cNvPr descr="paper_2_neuroplasticity_files/figure-docx/fig-predictor-corr-1.png" id="80" name="Picture"/>
                     <pic:cNvPicPr>
                       <a:picLocks noChangeArrowheads="1" noChangeAspect="1"/>
                     </pic:cNvPicPr>
                   </pic:nvPicPr>
                   <pic:blipFill>
-                    <a:blip r:embed="rId70"/>
+                    <a:blip r:embed="rId78"/>
                     <a:stretch>
                       <a:fillRect/>
                     </a:stretch>
@@ -7274,7 +7569,7 @@
         </w:drawing>
       </w:r>
     </w:p>
-    <w:bookmarkEnd w:id="73"/>
+    <w:bookmarkEnd w:id="81"/>
     <w:p>
       <w:pPr>
         <w:pStyle w:val="FigureNote"/>
@@ -7290,7 +7585,7 @@
         <w:t xml:space="preserve">. Correlations are computed on the z-scored predictors, over the participants who have both a baseline cognitive battery and an eyes-closed resting-state spectrum, pairwise-complete, so the n behind each cell varies slightly. Only the lower triangle is shown, the redundant mirror and the unit diagonal being omitted. The resting-state band powers are expected to be positively intercorrelated through the shared aperiodic 1/f background, which motivates the specparam robustness check and is why the projpred ranking must be read against this structure.</w:t>
       </w:r>
     </w:p>
-    <w:bookmarkStart w:id="74" w:name="tbl-predictor-desc"/>
+    <w:bookmarkStart w:id="82" w:name="tbl-predictor-desc"/>
     <w:p>
       <w:pPr>
         <w:pStyle w:val="FigureTitle"/>
@@ -8204,7 +8499,7 @@
         </w:tc>
       </w:tr>
     </w:tbl>
-    <w:bookmarkEnd w:id="74"/>
+    <w:bookmarkEnd w:id="82"/>
     <w:p>
       <w:pPr>
         <w:pStyle w:val="FigureNote"/>
@@ -8234,8 +8529,8 @@
         <w:t xml:space="preserve">column gives the number contributing to each row. Each row carries its own unit. Because a band power is the spectral density integrated over the band, its unit is squared microvolts, without the per-hertz denominator of a density.</w:t>
       </w:r>
     </w:p>
-    <w:bookmarkEnd w:id="75"/>
-    <w:bookmarkStart w:id="81" w:name="Xe62e416f341529a0d0d152441c6da885073b06c"/>
+    <w:bookmarkEnd w:id="83"/>
+    <w:bookmarkStart w:id="89" w:name="Xe62e416f341529a0d0d152441c6da885073b06c"/>
     <w:p>
       <w:pPr>
         <w:pStyle w:val="Heading2"/>
@@ -8703,7 +8998,7 @@
           <w:rPr>
             <w:rStyle w:val="Hyperlink"/>
           </w:rPr>
-          <w:t xml:space="preserve">Figure 4</w:t>
+          <w:t xml:space="preserve">Figure 6</w:t>
         </w:r>
       </w:hyperlink>
       <w:r>
@@ -8732,7 +9027,7 @@
           <w:rPr>
             <w:rStyle w:val="Hyperlink"/>
           </w:rPr>
-          <w:t xml:space="preserve">Figure 3</w:t>
+          <w:t xml:space="preserve">Figure 5</w:t>
         </w:r>
       </w:hyperlink>
       <w:r>
@@ -9901,13 +10196,13 @@
         <w:t xml:space="preserve">.</w:t>
       </w:r>
     </w:p>
-    <w:bookmarkStart w:id="79" w:name="fig-predictor-forest"/>
+    <w:bookmarkStart w:id="87" w:name="fig-predictor-forest"/>
     <w:p>
       <w:pPr>
         <w:pStyle w:val="FigureTitle"/>
       </w:pPr>
       <w:r>
-        <w:t xml:space="preserve">Figure 4</w:t>
+        <w:t xml:space="preserve">Figure 6</w:t>
       </w:r>
     </w:p>
     <w:p>
@@ -9927,18 +10222,18 @@
           <wp:inline>
             <wp:extent cx="5943600" cy="5486399"/>
             <wp:effectExtent b="0" l="0" r="0" t="0"/>
-            <wp:docPr descr="" title="" id="77" name="Picture"/>
+            <wp:docPr descr="" title="" id="85" name="Picture"/>
             <a:graphic>
               <a:graphicData uri="http://schemas.openxmlformats.org/drawingml/2006/picture">
                 <pic:pic>
                   <pic:nvPicPr>
-                    <pic:cNvPr descr="paper_2_neuroplasticity_files/figure-docx/fig-predictor-forest-1.png" id="78" name="Picture"/>
+                    <pic:cNvPr descr="paper_2_neuroplasticity_files/figure-docx/fig-predictor-forest-1.png" id="86" name="Picture"/>
                     <pic:cNvPicPr>
                       <a:picLocks noChangeArrowheads="1" noChangeAspect="1"/>
                     </pic:cNvPicPr>
                   </pic:nvPicPr>
                   <pic:blipFill>
-                    <a:blip r:embed="rId76"/>
+                    <a:blip r:embed="rId84"/>
                     <a:stretch>
                       <a:fillRect/>
                     </a:stretch>
@@ -9965,7 +10260,7 @@
         </w:drawing>
       </w:r>
     </w:p>
-    <w:bookmarkEnd w:id="79"/>
+    <w:bookmarkEnd w:id="87"/>
     <w:p>
       <w:pPr>
         <w:pStyle w:val="FigureNote"/>
@@ -9981,7 +10276,7 @@
         <w:t xml:space="preserve">. Points are posterior medians with 95% equal-tailed credible intervals for each baseline predictor’s association with overall accuracy (the main effect, the association at the average session) and with learning rate (the predictor-by-session interaction), in the pooled and gender-agreement-only models. Estimates are on the logit scale: main effects are the change in log-odds of a correct response per SD of the predictor, interaction terms the change in the per-session slope per SD. The two panels share a common x axis so the families are directly comparable, and the rate-interaction terms carry deliberately tighter priors than the main effects. Predictors are ordered working memory, inhibitory control and statistical learning (for the Stroop-based inhibitory-control predictor, higher scores mean poorer inhibition), then the resting-state measures. Intervals excluding zero indicate effects whose direction is well determined.</w:t>
       </w:r>
     </w:p>
-    <w:bookmarkStart w:id="80" w:name="tbl-reliability"/>
+    <w:bookmarkStart w:id="88" w:name="tbl-reliability"/>
     <w:p>
       <w:pPr>
         <w:pStyle w:val="FigureTitle"/>
@@ -10326,7 +10621,7 @@
         </w:tc>
       </w:tr>
     </w:tbl>
-    <w:bookmarkEnd w:id="80"/>
+    <w:bookmarkEnd w:id="88"/>
     <w:p>
       <w:pPr>
         <w:pStyle w:val="FigureNote"/>
@@ -10342,8 +10637,8 @@
         <w:t xml:space="preserve">. Columns give the group standard deviation, mean posterior standard error, and reliability of the intercept (a participant’s level at the mean session of the pooled standardisation frame) and of the session (rate) slope, for the pooled and gender-agreement-only models. The reliability column is the empirical-Bayes form, the variance of the shrunken by-participant posterior means over the model’s between-participant variance. The group SD and mean posterior SE columns are shown for context and are not the terms of a formula.</w:t>
       </w:r>
     </w:p>
-    <w:bookmarkEnd w:id="81"/>
-    <w:bookmarkStart w:id="86" w:name="Xbc6a84d8514ffc9e61cafa19d0cdbc32d799fd9"/>
+    <w:bookmarkEnd w:id="89"/>
+    <w:bookmarkStart w:id="94" w:name="Xbc6a84d8514ffc9e61cafa19d0cdbc32d799fd9"/>
     <w:p>
       <w:pPr>
         <w:pStyle w:val="Heading2"/>
@@ -11033,7 +11328,7 @@
           <w:rPr>
             <w:rStyle w:val="Hyperlink"/>
           </w:rPr>
-          <w:t xml:space="preserve">Figure 5</w:t>
+          <w:t xml:space="preserve">Figure 7</w:t>
         </w:r>
       </w:hyperlink>
       <w:r>
@@ -11406,13 +11701,13 @@
         <w:t xml:space="preserve">35.5 ms of ASRT learning.</w:t>
       </w:r>
     </w:p>
-    <w:bookmarkStart w:id="85" w:name="fig-prepost"/>
+    <w:bookmarkStart w:id="93" w:name="fig-prepost"/>
     <w:p>
       <w:pPr>
         <w:pStyle w:val="FigureTitle"/>
       </w:pPr>
       <w:r>
-        <w:t xml:space="preserve">Figure 5</w:t>
+        <w:t xml:space="preserve">Figure 7</w:t>
       </w:r>
     </w:p>
     <w:p>
@@ -11432,18 +11727,18 @@
           <wp:inline>
             <wp:extent cx="5943600" cy="3200399"/>
             <wp:effectExtent b="0" l="0" r="0" t="0"/>
-            <wp:docPr descr="" title="" id="83" name="Picture"/>
+            <wp:docPr descr="" title="" id="91" name="Picture"/>
             <a:graphic>
               <a:graphicData uri="http://schemas.openxmlformats.org/drawingml/2006/picture">
                 <pic:pic>
                   <pic:nvPicPr>
-                    <pic:cNvPr descr="paper_2_neuroplasticity_files/figure-docx/fig-prepost-1.png" id="84" name="Picture"/>
+                    <pic:cNvPr descr="paper_2_neuroplasticity_files/figure-docx/fig-prepost-1.png" id="92" name="Picture"/>
                     <pic:cNvPicPr>
                       <a:picLocks noChangeArrowheads="1" noChangeAspect="1"/>
                     </pic:cNvPicPr>
                   </pic:nvPicPr>
                   <pic:blipFill>
-                    <a:blip r:embed="rId82"/>
+                    <a:blip r:embed="rId90"/>
                     <a:stretch>
                       <a:fillRect/>
                     </a:stretch>
@@ -11470,7 +11765,7 @@
         </w:drawing>
       </w:r>
     </w:p>
-    <w:bookmarkEnd w:id="85"/>
+    <w:bookmarkEnd w:id="93"/>
     <w:p>
       <w:pPr>
         <w:pStyle w:val="FigureNote"/>
@@ -11486,9 +11781,9 @@
         <w:t xml:space="preserve">. Points are single-index session effects and, for the joint model, the digit-span change and the contrasts of each measure’s change against digit span (the reference level). Filled points mark effects whose 95% credible interval excludes zero; open points do not.</w:t>
       </w:r>
     </w:p>
-    <w:bookmarkEnd w:id="86"/>
-    <w:bookmarkEnd w:id="87"/>
-    <w:bookmarkStart w:id="92" w:name="discussion"/>
+    <w:bookmarkEnd w:id="94"/>
+    <w:bookmarkEnd w:id="95"/>
+    <w:bookmarkStart w:id="100" w:name="discussion"/>
     <w:p>
       <w:pPr>
         <w:pStyle w:val="Heading1"/>
@@ -11547,7 +11842,7 @@
         <w:t xml:space="preserve">that rose over training.</w:t>
       </w:r>
     </w:p>
-    <w:bookmarkStart w:id="88" w:name="X1e3b1832a878e7a6d320fade5d59b8bfd61bffe"/>
+    <w:bookmarkStart w:id="96" w:name="X1e3b1832a878e7a6d320fade5d59b8bfd61bffe"/>
     <w:p>
       <w:pPr>
         <w:pStyle w:val="Heading2"/>
@@ -12616,8 +12911,8 @@
         <w:t xml:space="preserve">training sessions.</w:t>
       </w:r>
     </w:p>
-    <w:bookmarkEnd w:id="88"/>
-    <w:bookmarkStart w:id="89" w:name="X9cd7329f04d04c39c69b0fdfbeefb69b044fb5a"/>
+    <w:bookmarkEnd w:id="96"/>
+    <w:bookmarkStart w:id="97" w:name="X9cd7329f04d04c39c69b0fdfbeefb69b044fb5a"/>
     <w:p>
       <w:pPr>
         <w:pStyle w:val="Heading2"/>
@@ -12956,8 +13251,8 @@
         <w:t xml:space="preserve">working-memory-specific change, and no more than that.</w:t>
       </w:r>
     </w:p>
-    <w:bookmarkEnd w:id="89"/>
-    <w:bookmarkStart w:id="90" w:name="limitations-and-future-directions"/>
+    <w:bookmarkEnd w:id="97"/>
+    <w:bookmarkStart w:id="98" w:name="limitations-and-future-directions"/>
     <w:p>
       <w:pPr>
         <w:pStyle w:val="Heading2"/>
@@ -13705,8 +14000,8 @@
         <w:t xml:space="preserve">findings are confined.</w:t>
       </w:r>
     </w:p>
-    <w:bookmarkEnd w:id="90"/>
-    <w:bookmarkStart w:id="91" w:name="conclusion"/>
+    <w:bookmarkEnd w:id="98"/>
+    <w:bookmarkStart w:id="99" w:name="conclusion"/>
     <w:p>
       <w:pPr>
         <w:pStyle w:val="Heading2"/>
@@ -13765,9 +14060,9 @@
         <w:t xml:space="preserve">short of being decisive.</w:t>
       </w:r>
     </w:p>
-    <w:bookmarkEnd w:id="91"/>
-    <w:bookmarkEnd w:id="92"/>
-    <w:bookmarkStart w:id="95" w:name="data-and-code-availability"/>
+    <w:bookmarkEnd w:id="99"/>
+    <w:bookmarkEnd w:id="100"/>
+    <w:bookmarkStart w:id="103" w:name="data-and-code-availability"/>
     <w:p>
       <w:pPr>
         <w:pStyle w:val="Heading1"/>
@@ -13792,7 +14087,7 @@
       <w:r>
         <w:t xml:space="preserve"> </w:t>
       </w:r>
-      <w:hyperlink r:id="rId93">
+      <w:hyperlink r:id="rId101">
         <w:r>
           <w:rPr>
             <w:rStyle w:val="Hyperlink"/>
@@ -13836,7 +14131,7 @@
       <w:r>
         <w:t xml:space="preserve"> </w:t>
       </w:r>
-      <w:hyperlink r:id="rId94">
+      <w:hyperlink r:id="rId102">
         <w:r>
           <w:rPr>
             <w:rStyle w:val="Hyperlink"/>
@@ -14071,8 +14366,8 @@
         <w:t xml:space="preserve">.</w:t>
       </w:r>
     </w:p>
-    <w:bookmarkEnd w:id="95"/>
-    <w:bookmarkStart w:id="96" w:name="supplementary-material"/>
+    <w:bookmarkEnd w:id="103"/>
+    <w:bookmarkStart w:id="104" w:name="supplementary-material"/>
     <w:p>
       <w:pPr>
         <w:pStyle w:val="Heading1"/>
@@ -14162,7 +14457,7 @@
         <w:br w:type="page"/>
       </w:r>
     </w:p>
-    <w:bookmarkEnd w:id="96"/>
+    <w:bookmarkEnd w:id="104"/>
     <w:p>
       <w:pPr>
         <w:pStyle w:val="Heading1"/>
@@ -14171,8 +14466,8 @@
         <w:t xml:space="preserve">References</w:t>
       </w:r>
     </w:p>
-    <w:bookmarkStart w:id="273" w:name="refs"/>
-    <w:bookmarkStart w:id="98" w:name="ref-anwylirvine2020"/>
+    <w:bookmarkStart w:id="281" w:name="refs"/>
+    <w:bookmarkStart w:id="106" w:name="ref-anwylirvine2020"/>
     <w:p>
       <w:pPr>
         <w:pStyle w:val="Bibliography"/>
@@ -14221,7 +14516,7 @@
       <w:r>
         <w:t xml:space="preserve"> </w:t>
       </w:r>
-      <w:hyperlink r:id="rId97">
+      <w:hyperlink r:id="rId105">
         <w:r>
           <w:rPr>
             <w:rStyle w:val="Hyperlink"/>
@@ -14230,8 +14525,8 @@
         </w:r>
       </w:hyperlink>
     </w:p>
-    <w:bookmarkEnd w:id="98"/>
-    <w:bookmarkStart w:id="100" w:name="ref-barnett2005"/>
+    <w:bookmarkEnd w:id="106"/>
+    <w:bookmarkStart w:id="108" w:name="ref-barnett2005"/>
     <w:p>
       <w:pPr>
         <w:pStyle w:val="Bibliography"/>
@@ -14268,7 +14563,7 @@
       <w:r>
         <w:t xml:space="preserve"> </w:t>
       </w:r>
-      <w:hyperlink r:id="rId99">
+      <w:hyperlink r:id="rId107">
         <w:r>
           <w:rPr>
             <w:rStyle w:val="Hyperlink"/>
@@ -14277,8 +14572,8 @@
         </w:r>
       </w:hyperlink>
     </w:p>
-    <w:bookmarkEnd w:id="100"/>
-    <w:bookmarkStart w:id="102" w:name="ref-barr2013"/>
+    <w:bookmarkEnd w:id="108"/>
+    <w:bookmarkStart w:id="110" w:name="ref-barr2013"/>
     <w:p>
       <w:pPr>
         <w:pStyle w:val="Bibliography"/>
@@ -14315,7 +14610,7 @@
       <w:r>
         <w:t xml:space="preserve"> </w:t>
       </w:r>
-      <w:hyperlink r:id="rId101">
+      <w:hyperlink r:id="rId109">
         <w:r>
           <w:rPr>
             <w:rStyle w:val="Hyperlink"/>
@@ -14324,8 +14619,8 @@
         </w:r>
       </w:hyperlink>
     </w:p>
-    <w:bookmarkEnd w:id="102"/>
-    <w:bookmarkStart w:id="104" w:name="ref-berggren2020"/>
+    <w:bookmarkEnd w:id="110"/>
+    <w:bookmarkStart w:id="112" w:name="ref-berggren2020"/>
     <w:p>
       <w:pPr>
         <w:pStyle w:val="Bibliography"/>
@@ -14362,7 +14657,7 @@
       <w:r>
         <w:t xml:space="preserve"> </w:t>
       </w:r>
-      <w:hyperlink r:id="rId103">
+      <w:hyperlink r:id="rId111">
         <w:r>
           <w:rPr>
             <w:rStyle w:val="Hyperlink"/>
@@ -14371,8 +14666,8 @@
         </w:r>
       </w:hyperlink>
     </w:p>
-    <w:bookmarkEnd w:id="104"/>
-    <w:bookmarkStart w:id="105" w:name="ref-lesstransfer2026"/>
+    <w:bookmarkEnd w:id="112"/>
+    <w:bookmarkStart w:id="113" w:name="ref-lesstransfer2026"/>
     <w:p>
       <w:pPr>
         <w:pStyle w:val="Bibliography"/>
@@ -14481,8 +14776,8 @@
         <w:t xml:space="preserve">[Manuscript submitted for publication].</w:t>
       </w:r>
     </w:p>
-    <w:bookmarkEnd w:id="105"/>
-    <w:bookmarkStart w:id="107" w:name="ref-boot2013"/>
+    <w:bookmarkEnd w:id="113"/>
+    <w:bookmarkStart w:id="115" w:name="ref-boot2013"/>
     <w:p>
       <w:pPr>
         <w:pStyle w:val="Bibliography"/>
@@ -14519,7 +14814,7 @@
       <w:r>
         <w:t xml:space="preserve"> </w:t>
       </w:r>
-      <w:hyperlink r:id="rId106">
+      <w:hyperlink r:id="rId114">
         <w:r>
           <w:rPr>
             <w:rStyle w:val="Hyperlink"/>
@@ -14528,8 +14823,8 @@
         </w:r>
       </w:hyperlink>
     </w:p>
-    <w:bookmarkEnd w:id="107"/>
-    <w:bookmarkStart w:id="109" w:name="ref-brauer2018"/>
+    <w:bookmarkEnd w:id="115"/>
+    <w:bookmarkStart w:id="117" w:name="ref-brauer2018"/>
     <w:p>
       <w:pPr>
         <w:pStyle w:val="Bibliography"/>
@@ -14566,7 +14861,7 @@
       <w:r>
         <w:t xml:space="preserve"> </w:t>
       </w:r>
-      <w:hyperlink r:id="rId108">
+      <w:hyperlink r:id="rId116">
         <w:r>
           <w:rPr>
             <w:rStyle w:val="Hyperlink"/>
@@ -14575,8 +14870,8 @@
         </w:r>
       </w:hyperlink>
     </w:p>
-    <w:bookmarkEnd w:id="109"/>
-    <w:bookmarkStart w:id="111" w:name="ref-burkner2017"/>
+    <w:bookmarkEnd w:id="117"/>
+    <w:bookmarkStart w:id="119" w:name="ref-burkner2017"/>
     <w:p>
       <w:pPr>
         <w:pStyle w:val="Bibliography"/>
@@ -14655,7 +14950,7 @@
       <w:r>
         <w:t xml:space="preserve"> </w:t>
       </w:r>
-      <w:hyperlink r:id="rId110">
+      <w:hyperlink r:id="rId118">
         <w:r>
           <w:rPr>
             <w:rStyle w:val="Hyperlink"/>
@@ -14664,8 +14959,8 @@
         </w:r>
       </w:hyperlink>
     </w:p>
-    <w:bookmarkEnd w:id="111"/>
-    <w:bookmarkStart w:id="113" w:name="ref-burkner2018"/>
+    <w:bookmarkEnd w:id="119"/>
+    <w:bookmarkStart w:id="121" w:name="ref-burkner2018"/>
     <w:p>
       <w:pPr>
         <w:pStyle w:val="Bibliography"/>
@@ -14735,7 +15030,7 @@
       <w:r>
         <w:t xml:space="preserve"> </w:t>
       </w:r>
-      <w:hyperlink r:id="rId112">
+      <w:hyperlink r:id="rId120">
         <w:r>
           <w:rPr>
             <w:rStyle w:val="Hyperlink"/>
@@ -14744,8 +15039,8 @@
         </w:r>
       </w:hyperlink>
     </w:p>
-    <w:bookmarkEnd w:id="113"/>
-    <w:bookmarkStart w:id="115" w:name="ref-calamia2012"/>
+    <w:bookmarkEnd w:id="121"/>
+    <w:bookmarkStart w:id="123" w:name="ref-calamia2012"/>
     <w:p>
       <w:pPr>
         <w:pStyle w:val="Bibliography"/>
@@ -14782,7 +15077,7 @@
       <w:r>
         <w:t xml:space="preserve"> </w:t>
       </w:r>
-      <w:hyperlink r:id="rId114">
+      <w:hyperlink r:id="rId122">
         <w:r>
           <w:rPr>
             <w:rStyle w:val="Hyperlink"/>
@@ -14791,8 +15086,8 @@
         </w:r>
       </w:hyperlink>
     </w:p>
-    <w:bookmarkEnd w:id="115"/>
-    <w:bookmarkStart w:id="117" w:name="ref-carpenter2017"/>
+    <w:bookmarkEnd w:id="123"/>
+    <w:bookmarkStart w:id="125" w:name="ref-carpenter2017"/>
     <w:p>
       <w:pPr>
         <w:pStyle w:val="Bibliography"/>
@@ -14838,7 +15133,7 @@
       <w:r>
         <w:t xml:space="preserve"> </w:t>
       </w:r>
-      <w:hyperlink r:id="rId116">
+      <w:hyperlink r:id="rId124">
         <w:r>
           <w:rPr>
             <w:rStyle w:val="Hyperlink"/>
@@ -14847,8 +15142,8 @@
         </w:r>
       </w:hyperlink>
     </w:p>
-    <w:bookmarkEnd w:id="117"/>
-    <w:bookmarkStart w:id="119" w:name="ref-catalina2021"/>
+    <w:bookmarkEnd w:id="125"/>
+    <w:bookmarkStart w:id="127" w:name="ref-catalina2021"/>
     <w:p>
       <w:pPr>
         <w:pStyle w:val="Bibliography"/>
@@ -14872,7 +15167,7 @@
       <w:r>
         <w:t xml:space="preserve"> </w:t>
       </w:r>
-      <w:hyperlink r:id="rId118">
+      <w:hyperlink r:id="rId126">
         <w:r>
           <w:rPr>
             <w:rStyle w:val="Hyperlink"/>
@@ -14881,8 +15176,8 @@
         </w:r>
       </w:hyperlink>
     </w:p>
-    <w:bookmarkEnd w:id="119"/>
-    <w:bookmarkStart w:id="121" w:name="ref-chen2022"/>
+    <w:bookmarkEnd w:id="127"/>
+    <w:bookmarkStart w:id="129" w:name="ref-chen2022"/>
     <w:p>
       <w:pPr>
         <w:pStyle w:val="Bibliography"/>
@@ -14931,7 +15226,7 @@
       <w:r>
         <w:t xml:space="preserve"> </w:t>
       </w:r>
-      <w:hyperlink r:id="rId120">
+      <w:hyperlink r:id="rId128">
         <w:r>
           <w:rPr>
             <w:rStyle w:val="Hyperlink"/>
@@ -14940,8 +15235,8 @@
         </w:r>
       </w:hyperlink>
     </w:p>
-    <w:bookmarkEnd w:id="121"/>
-    <w:bookmarkStart w:id="123" w:name="ref-corcoran2018"/>
+    <w:bookmarkEnd w:id="129"/>
+    <w:bookmarkStart w:id="131" w:name="ref-corcoran2018"/>
     <w:p>
       <w:pPr>
         <w:pStyle w:val="Bibliography"/>
@@ -14984,7 +15279,7 @@
       <w:r>
         <w:t xml:space="preserve"> </w:t>
       </w:r>
-      <w:hyperlink r:id="rId122">
+      <w:hyperlink r:id="rId130">
         <w:r>
           <w:rPr>
             <w:rStyle w:val="Hyperlink"/>
@@ -14993,8 +15288,8 @@
         </w:r>
       </w:hyperlink>
     </w:p>
-    <w:bookmarkEnd w:id="123"/>
-    <w:bookmarkStart w:id="125" w:name="ref-depaoli2017"/>
+    <w:bookmarkEnd w:id="131"/>
+    <w:bookmarkStart w:id="133" w:name="ref-depaoli2017"/>
     <w:p>
       <w:pPr>
         <w:pStyle w:val="Bibliography"/>
@@ -15052,7 +15347,7 @@
       <w:r>
         <w:t xml:space="preserve"> </w:t>
       </w:r>
-      <w:hyperlink r:id="rId124">
+      <w:hyperlink r:id="rId132">
         <w:r>
           <w:rPr>
             <w:rStyle w:val="Hyperlink"/>
@@ -15061,8 +15356,8 @@
         </w:r>
       </w:hyperlink>
     </w:p>
-    <w:bookmarkEnd w:id="125"/>
-    <w:bookmarkStart w:id="127" w:name="ref-dick2019"/>
+    <w:bookmarkEnd w:id="133"/>
+    <w:bookmarkStart w:id="135" w:name="ref-dick2019"/>
     <w:p>
       <w:pPr>
         <w:pStyle w:val="Bibliography"/>
@@ -15111,7 +15406,7 @@
       <w:r>
         <w:t xml:space="preserve"> </w:t>
       </w:r>
-      <w:hyperlink r:id="rId126">
+      <w:hyperlink r:id="rId134">
         <w:r>
           <w:rPr>
             <w:rStyle w:val="Hyperlink"/>
@@ -15120,8 +15415,8 @@
         </w:r>
       </w:hyperlink>
     </w:p>
-    <w:bookmarkEnd w:id="127"/>
-    <w:bookmarkStart w:id="129" w:name="ref-donoghue2020"/>
+    <w:bookmarkEnd w:id="135"/>
+    <w:bookmarkStart w:id="137" w:name="ref-donoghue2020"/>
     <w:p>
       <w:pPr>
         <w:pStyle w:val="Bibliography"/>
@@ -15158,7 +15453,7 @@
       <w:r>
         <w:t xml:space="preserve"> </w:t>
       </w:r>
-      <w:hyperlink r:id="rId128">
+      <w:hyperlink r:id="rId136">
         <w:r>
           <w:rPr>
             <w:rStyle w:val="Hyperlink"/>
@@ -15167,8 +15462,8 @@
         </w:r>
       </w:hyperlink>
     </w:p>
-    <w:bookmarkEnd w:id="129"/>
-    <w:bookmarkStart w:id="131" w:name="ref-draheim2019"/>
+    <w:bookmarkEnd w:id="137"/>
+    <w:bookmarkStart w:id="139" w:name="ref-draheim2019"/>
     <w:p>
       <w:pPr>
         <w:pStyle w:val="Bibliography"/>
@@ -15205,7 +15500,7 @@
       <w:r>
         <w:t xml:space="preserve"> </w:t>
       </w:r>
-      <w:hyperlink r:id="rId130">
+      <w:hyperlink r:id="rId138">
         <w:r>
           <w:rPr>
             <w:rStyle w:val="Hyperlink"/>
@@ -15214,8 +15509,8 @@
         </w:r>
       </w:hyperlink>
     </w:p>
-    <w:bookmarkEnd w:id="131"/>
-    <w:bookmarkStart w:id="133" w:name="ref-euler2024"/>
+    <w:bookmarkEnd w:id="139"/>
+    <w:bookmarkStart w:id="141" w:name="ref-euler2024"/>
     <w:p>
       <w:pPr>
         <w:pStyle w:val="Bibliography"/>
@@ -15264,7 +15559,7 @@
       <w:r>
         <w:t xml:space="preserve"> </w:t>
       </w:r>
-      <w:hyperlink r:id="rId132">
+      <w:hyperlink r:id="rId140">
         <w:r>
           <w:rPr>
             <w:rStyle w:val="Hyperlink"/>
@@ -15273,8 +15568,8 @@
         </w:r>
       </w:hyperlink>
     </w:p>
-    <w:bookmarkEnd w:id="133"/>
-    <w:bookmarkStart w:id="135" w:name="ref-farkas2024"/>
+    <w:bookmarkEnd w:id="141"/>
+    <w:bookmarkStart w:id="143" w:name="ref-farkas2024"/>
     <w:p>
       <w:pPr>
         <w:pStyle w:val="Bibliography"/>
@@ -15320,7 +15615,7 @@
       <w:r>
         <w:t xml:space="preserve"> </w:t>
       </w:r>
-      <w:hyperlink r:id="rId134">
+      <w:hyperlink r:id="rId142">
         <w:r>
           <w:rPr>
             <w:rStyle w:val="Hyperlink"/>
@@ -15329,8 +15624,8 @@
         </w:r>
       </w:hyperlink>
     </w:p>
-    <w:bookmarkEnd w:id="135"/>
-    <w:bookmarkStart w:id="137" w:name="ref-gabry2019"/>
+    <w:bookmarkEnd w:id="143"/>
+    <w:bookmarkStart w:id="145" w:name="ref-gabry2019"/>
     <w:p>
       <w:pPr>
         <w:pStyle w:val="Bibliography"/>
@@ -15379,7 +15674,7 @@
       <w:r>
         <w:t xml:space="preserve"> </w:t>
       </w:r>
-      <w:hyperlink r:id="rId136">
+      <w:hyperlink r:id="rId144">
         <w:r>
           <w:rPr>
             <w:rStyle w:val="Hyperlink"/>
@@ -15388,8 +15683,8 @@
         </w:r>
       </w:hyperlink>
     </w:p>
-    <w:bookmarkEnd w:id="137"/>
-    <w:bookmarkStart w:id="139" w:name="ref-gao2017"/>
+    <w:bookmarkEnd w:id="145"/>
+    <w:bookmarkStart w:id="147" w:name="ref-gao2017"/>
     <w:p>
       <w:pPr>
         <w:pStyle w:val="Bibliography"/>
@@ -15426,7 +15721,7 @@
       <w:r>
         <w:t xml:space="preserve"> </w:t>
       </w:r>
-      <w:hyperlink r:id="rId138">
+      <w:hyperlink r:id="rId146">
         <w:r>
           <w:rPr>
             <w:rStyle w:val="Hyperlink"/>
@@ -15435,8 +15730,8 @@
         </w:r>
       </w:hyperlink>
     </w:p>
-    <w:bookmarkEnd w:id="139"/>
-    <w:bookmarkStart w:id="141" w:name="ref-gelman2005"/>
+    <w:bookmarkEnd w:id="147"/>
+    <w:bookmarkStart w:id="149" w:name="ref-gelman2005"/>
     <w:p>
       <w:pPr>
         <w:pStyle w:val="Bibliography"/>
@@ -15473,7 +15768,7 @@
       <w:r>
         <w:t xml:space="preserve"> </w:t>
       </w:r>
-      <w:hyperlink r:id="rId140">
+      <w:hyperlink r:id="rId148">
         <w:r>
           <w:rPr>
             <w:rStyle w:val="Hyperlink"/>
@@ -15482,8 +15777,8 @@
         </w:r>
       </w:hyperlink>
     </w:p>
-    <w:bookmarkEnd w:id="141"/>
-    <w:bookmarkStart w:id="143" w:name="ref-gelman2006"/>
+    <w:bookmarkEnd w:id="149"/>
+    <w:bookmarkStart w:id="151" w:name="ref-gelman2006"/>
     <w:p>
       <w:pPr>
         <w:pStyle w:val="Bibliography"/>
@@ -15538,7 +15833,7 @@
       <w:r>
         <w:t xml:space="preserve"> </w:t>
       </w:r>
-      <w:hyperlink r:id="rId142">
+      <w:hyperlink r:id="rId150">
         <w:r>
           <w:rPr>
             <w:rStyle w:val="Hyperlink"/>
@@ -15547,8 +15842,8 @@
         </w:r>
       </w:hyperlink>
     </w:p>
-    <w:bookmarkEnd w:id="143"/>
-    <w:bookmarkStart w:id="145" w:name="ref-gelmancarlin2014"/>
+    <w:bookmarkEnd w:id="151"/>
+    <w:bookmarkStart w:id="153" w:name="ref-gelmancarlin2014"/>
     <w:p>
       <w:pPr>
         <w:pStyle w:val="Bibliography"/>
@@ -15609,7 +15904,7 @@
       <w:r>
         <w:t xml:space="preserve"> </w:t>
       </w:r>
-      <w:hyperlink r:id="rId144">
+      <w:hyperlink r:id="rId152">
         <w:r>
           <w:rPr>
             <w:rStyle w:val="Hyperlink"/>
@@ -15618,8 +15913,8 @@
         </w:r>
       </w:hyperlink>
     </w:p>
-    <w:bookmarkEnd w:id="145"/>
-    <w:bookmarkStart w:id="147" w:name="ref-gelmanhill2007"/>
+    <w:bookmarkEnd w:id="153"/>
+    <w:bookmarkStart w:id="155" w:name="ref-gelmanhill2007"/>
     <w:p>
       <w:pPr>
         <w:pStyle w:val="Bibliography"/>
@@ -15643,7 +15938,7 @@
       <w:r>
         <w:t xml:space="preserve"> </w:t>
       </w:r>
-      <w:hyperlink r:id="rId146">
+      <w:hyperlink r:id="rId154">
         <w:r>
           <w:rPr>
             <w:rStyle w:val="Hyperlink"/>
@@ -15652,8 +15947,8 @@
         </w:r>
       </w:hyperlink>
     </w:p>
-    <w:bookmarkEnd w:id="147"/>
-    <w:bookmarkStart w:id="149" w:name="ref-gelman2008"/>
+    <w:bookmarkEnd w:id="155"/>
+    <w:bookmarkStart w:id="157" w:name="ref-gelman2008"/>
     <w:p>
       <w:pPr>
         <w:pStyle w:val="Bibliography"/>
@@ -15690,7 +15985,7 @@
       <w:r>
         <w:t xml:space="preserve"> </w:t>
       </w:r>
-      <w:hyperlink r:id="rId148">
+      <w:hyperlink r:id="rId156">
         <w:r>
           <w:rPr>
             <w:rStyle w:val="Hyperlink"/>
@@ -15699,8 +15994,8 @@
         </w:r>
       </w:hyperlink>
     </w:p>
-    <w:bookmarkEnd w:id="149"/>
-    <w:bookmarkStart w:id="151" w:name="ref-gerster2022"/>
+    <w:bookmarkEnd w:id="157"/>
+    <w:bookmarkStart w:id="159" w:name="ref-gerster2022"/>
     <w:p>
       <w:pPr>
         <w:pStyle w:val="Bibliography"/>
@@ -15737,7 +16032,7 @@
       <w:r>
         <w:t xml:space="preserve"> </w:t>
       </w:r>
-      <w:hyperlink r:id="rId150">
+      <w:hyperlink r:id="rId158">
         <w:r>
           <w:rPr>
             <w:rStyle w:val="Hyperlink"/>
@@ -15746,8 +16041,8 @@
         </w:r>
       </w:hyperlink>
     </w:p>
-    <w:bookmarkEnd w:id="151"/>
-    <w:bookmarkStart w:id="153" w:name="ref-gonzalezalonso2025"/>
+    <w:bookmarkEnd w:id="159"/>
+    <w:bookmarkStart w:id="161" w:name="ref-gonzalezalonso2025"/>
     <w:p>
       <w:pPr>
         <w:pStyle w:val="Bibliography"/>
@@ -15799,7 +16094,7 @@
       <w:r>
         <w:t xml:space="preserve"> </w:t>
       </w:r>
-      <w:hyperlink r:id="rId152">
+      <w:hyperlink r:id="rId160">
         <w:r>
           <w:rPr>
             <w:rStyle w:val="Hyperlink"/>
@@ -15808,8 +16103,8 @@
         </w:r>
       </w:hyperlink>
     </w:p>
-    <w:bookmarkEnd w:id="153"/>
-    <w:bookmarkStart w:id="155" w:name="ref-grandy2013"/>
+    <w:bookmarkEnd w:id="161"/>
+    <w:bookmarkStart w:id="163" w:name="ref-grandy2013"/>
     <w:p>
       <w:pPr>
         <w:pStyle w:val="Bibliography"/>
@@ -15846,7 +16141,7 @@
       <w:r>
         <w:t xml:space="preserve"> </w:t>
       </w:r>
-      <w:hyperlink r:id="rId154">
+      <w:hyperlink r:id="rId162">
         <w:r>
           <w:rPr>
             <w:rStyle w:val="Hyperlink"/>
@@ -15855,8 +16150,8 @@
         </w:r>
       </w:hyperlink>
     </w:p>
-    <w:bookmarkEnd w:id="155"/>
-    <w:bookmarkStart w:id="157" w:name="ref-grandy2013trait"/>
+    <w:bookmarkEnd w:id="163"/>
+    <w:bookmarkStart w:id="165" w:name="ref-grandy2013trait"/>
     <w:p>
       <w:pPr>
         <w:pStyle w:val="Bibliography"/>
@@ -15893,7 +16188,7 @@
       <w:r>
         <w:t xml:space="preserve"> </w:t>
       </w:r>
-      <w:hyperlink r:id="rId156">
+      <w:hyperlink r:id="rId164">
         <w:r>
           <w:rPr>
             <w:rStyle w:val="Hyperlink"/>
@@ -15902,8 +16197,8 @@
         </w:r>
       </w:hyperlink>
     </w:p>
-    <w:bookmarkEnd w:id="157"/>
-    <w:bookmarkStart w:id="159" w:name="ref-grossmann2023"/>
+    <w:bookmarkEnd w:id="165"/>
+    <w:bookmarkStart w:id="167" w:name="ref-grossmann2023"/>
     <w:p>
       <w:pPr>
         <w:pStyle w:val="Bibliography"/>
@@ -15940,7 +16235,7 @@
       <w:r>
         <w:t xml:space="preserve"> </w:t>
       </w:r>
-      <w:hyperlink r:id="rId158">
+      <w:hyperlink r:id="rId166">
         <w:r>
           <w:rPr>
             <w:rStyle w:val="Hyperlink"/>
@@ -15949,8 +16244,8 @@
         </w:r>
       </w:hyperlink>
     </w:p>
-    <w:bookmarkEnd w:id="159"/>
-    <w:bookmarkStart w:id="161" w:name="ref-heathcote2000"/>
+    <w:bookmarkEnd w:id="167"/>
+    <w:bookmarkStart w:id="169" w:name="ref-heathcote2000"/>
     <w:p>
       <w:pPr>
         <w:pStyle w:val="Bibliography"/>
@@ -15987,7 +16282,7 @@
       <w:r>
         <w:t xml:space="preserve"> </w:t>
       </w:r>
-      <w:hyperlink r:id="rId160">
+      <w:hyperlink r:id="rId168">
         <w:r>
           <w:rPr>
             <w:rStyle w:val="Hyperlink"/>
@@ -15996,8 +16291,8 @@
         </w:r>
       </w:hyperlink>
     </w:p>
-    <w:bookmarkEnd w:id="161"/>
-    <w:bookmarkStart w:id="163" w:name="ref-hedge2021"/>
+    <w:bookmarkEnd w:id="169"/>
+    <w:bookmarkStart w:id="171" w:name="ref-hedge2021"/>
     <w:p>
       <w:pPr>
         <w:pStyle w:val="Bibliography"/>
@@ -16034,7 +16329,7 @@
       <w:r>
         <w:t xml:space="preserve"> </w:t>
       </w:r>
-      <w:hyperlink r:id="rId162">
+      <w:hyperlink r:id="rId170">
         <w:r>
           <w:rPr>
             <w:rStyle w:val="Hyperlink"/>
@@ -16043,8 +16338,8 @@
         </w:r>
       </w:hyperlink>
     </w:p>
-    <w:bookmarkEnd w:id="163"/>
-    <w:bookmarkStart w:id="165" w:name="ref-hedge2018"/>
+    <w:bookmarkEnd w:id="171"/>
+    <w:bookmarkStart w:id="173" w:name="ref-hedge2018"/>
     <w:p>
       <w:pPr>
         <w:pStyle w:val="Bibliography"/>
@@ -16081,7 +16376,7 @@
       <w:r>
         <w:t xml:space="preserve"> </w:t>
       </w:r>
-      <w:hyperlink r:id="rId164">
+      <w:hyperlink r:id="rId172">
         <w:r>
           <w:rPr>
             <w:rStyle w:val="Hyperlink"/>
@@ -16090,8 +16385,8 @@
         </w:r>
       </w:hyperlink>
     </w:p>
-    <w:bookmarkEnd w:id="165"/>
-    <w:bookmarkStart w:id="167" w:name="ref-howard1997"/>
+    <w:bookmarkEnd w:id="173"/>
+    <w:bookmarkStart w:id="175" w:name="ref-howard1997"/>
     <w:p>
       <w:pPr>
         <w:pStyle w:val="Bibliography"/>
@@ -16128,7 +16423,7 @@
       <w:r>
         <w:t xml:space="preserve"> </w:t>
       </w:r>
-      <w:hyperlink r:id="rId166">
+      <w:hyperlink r:id="rId174">
         <w:r>
           <w:rPr>
             <w:rStyle w:val="Hyperlink"/>
@@ -16137,8 +16432,8 @@
         </w:r>
       </w:hyperlink>
     </w:p>
-    <w:bookmarkEnd w:id="167"/>
-    <w:bookmarkStart w:id="169" w:name="ref-huensch2024"/>
+    <w:bookmarkEnd w:id="175"/>
+    <w:bookmarkStart w:id="177" w:name="ref-huensch2024"/>
     <w:p>
       <w:pPr>
         <w:pStyle w:val="Bibliography"/>
@@ -16199,7 +16494,7 @@
       <w:r>
         <w:t xml:space="preserve"> </w:t>
       </w:r>
-      <w:hyperlink r:id="rId168">
+      <w:hyperlink r:id="rId176">
         <w:r>
           <w:rPr>
             <w:rStyle w:val="Hyperlink"/>
@@ -16208,8 +16503,8 @@
         </w:r>
       </w:hyperlink>
     </w:p>
-    <w:bookmarkEnd w:id="169"/>
-    <w:bookmarkStart w:id="171" w:name="ref-humberg2024"/>
+    <w:bookmarkEnd w:id="177"/>
+    <w:bookmarkStart w:id="179" w:name="ref-humberg2024"/>
     <w:p>
       <w:pPr>
         <w:pStyle w:val="Bibliography"/>
@@ -16246,7 +16541,7 @@
       <w:r>
         <w:t xml:space="preserve"> </w:t>
       </w:r>
-      <w:hyperlink r:id="rId170">
+      <w:hyperlink r:id="rId178">
         <w:r>
           <w:rPr>
             <w:rStyle w:val="Hyperlink"/>
@@ -16255,8 +16550,8 @@
         </w:r>
       </w:hyperlink>
     </w:p>
-    <w:bookmarkEnd w:id="171"/>
-    <w:bookmarkStart w:id="173" w:name="ref-kenanidis2026"/>
+    <w:bookmarkEnd w:id="179"/>
+    <w:bookmarkStart w:id="181" w:name="ref-kenanidis2026"/>
     <w:p>
       <w:pPr>
         <w:pStyle w:val="Bibliography"/>
@@ -16293,7 +16588,7 @@
       <w:r>
         <w:t xml:space="preserve"> </w:t>
       </w:r>
-      <w:hyperlink r:id="rId172">
+      <w:hyperlink r:id="rId180">
         <w:r>
           <w:rPr>
             <w:rStyle w:val="Hyperlink"/>
@@ -16302,8 +16597,8 @@
         </w:r>
       </w:hyperlink>
     </w:p>
-    <w:bookmarkEnd w:id="173"/>
-    <w:bookmarkStart w:id="175" w:name="ref-kliesch2022"/>
+    <w:bookmarkEnd w:id="181"/>
+    <w:bookmarkStart w:id="183" w:name="ref-kliesch2022"/>
     <w:p>
       <w:pPr>
         <w:pStyle w:val="Bibliography"/>
@@ -16340,7 +16635,7 @@
       <w:r>
         <w:t xml:space="preserve"> </w:t>
       </w:r>
-      <w:hyperlink r:id="rId174">
+      <w:hyperlink r:id="rId182">
         <w:r>
           <w:rPr>
             <w:rStyle w:val="Hyperlink"/>
@@ -16349,8 +16644,8 @@
         </w:r>
       </w:hyperlink>
     </w:p>
-    <w:bookmarkEnd w:id="175"/>
-    <w:bookmarkStart w:id="177" w:name="ref-kliesch2021"/>
+    <w:bookmarkEnd w:id="183"/>
+    <w:bookmarkStart w:id="185" w:name="ref-kliesch2021"/>
     <w:p>
       <w:pPr>
         <w:pStyle w:val="Bibliography"/>
@@ -16399,7 +16694,7 @@
       <w:r>
         <w:t xml:space="preserve"> </w:t>
       </w:r>
-      <w:hyperlink r:id="rId176">
+      <w:hyperlink r:id="rId184">
         <w:r>
           <w:rPr>
             <w:rStyle w:val="Hyperlink"/>
@@ -16408,8 +16703,8 @@
         </w:r>
       </w:hyperlink>
     </w:p>
-    <w:bookmarkEnd w:id="177"/>
-    <w:bookmarkStart w:id="179" w:name="ref-klimesch1999"/>
+    <w:bookmarkEnd w:id="185"/>
+    <w:bookmarkStart w:id="187" w:name="ref-klimesch1999"/>
     <w:p>
       <w:pPr>
         <w:pStyle w:val="Bibliography"/>
@@ -16458,7 +16753,7 @@
       <w:r>
         <w:t xml:space="preserve"> </w:t>
       </w:r>
-      <w:hyperlink r:id="rId178">
+      <w:hyperlink r:id="rId186">
         <w:r>
           <w:rPr>
             <w:rStyle w:val="Hyperlink"/>
@@ -16467,8 +16762,8 @@
         </w:r>
       </w:hyperlink>
     </w:p>
-    <w:bookmarkEnd w:id="179"/>
-    <w:bookmarkStart w:id="181" w:name="ref-kruschke2021"/>
+    <w:bookmarkEnd w:id="187"/>
+    <w:bookmarkStart w:id="189" w:name="ref-kruschke2021"/>
     <w:p>
       <w:pPr>
         <w:pStyle w:val="Bibliography"/>
@@ -16517,7 +16812,7 @@
       <w:r>
         <w:t xml:space="preserve"> </w:t>
       </w:r>
-      <w:hyperlink r:id="rId180">
+      <w:hyperlink r:id="rId188">
         <w:r>
           <w:rPr>
             <w:rStyle w:val="Hyperlink"/>
@@ -16526,8 +16821,8 @@
         </w:r>
       </w:hyperlink>
     </w:p>
-    <w:bookmarkEnd w:id="181"/>
-    <w:bookmarkStart w:id="183" w:name="ref-kruschke2018"/>
+    <w:bookmarkEnd w:id="189"/>
+    <w:bookmarkStart w:id="191" w:name="ref-kruschke2018"/>
     <w:p>
       <w:pPr>
         <w:pStyle w:val="Bibliography"/>
@@ -16597,7 +16892,7 @@
       <w:r>
         <w:t xml:space="preserve"> </w:t>
       </w:r>
-      <w:hyperlink r:id="rId182">
+      <w:hyperlink r:id="rId190">
         <w:r>
           <w:rPr>
             <w:rStyle w:val="Hyperlink"/>
@@ -16606,8 +16901,8 @@
         </w:r>
       </w:hyperlink>
     </w:p>
-    <w:bookmarkEnd w:id="183"/>
-    <w:bookmarkStart w:id="185" w:name="ref-kurokawa2026"/>
+    <w:bookmarkEnd w:id="191"/>
+    <w:bookmarkStart w:id="193" w:name="ref-kurokawa2026"/>
     <w:p>
       <w:pPr>
         <w:pStyle w:val="Bibliography"/>
@@ -16631,7 +16926,7 @@
       <w:r>
         <w:t xml:space="preserve"> </w:t>
       </w:r>
-      <w:hyperlink r:id="rId184">
+      <w:hyperlink r:id="rId192">
         <w:r>
           <w:rPr>
             <w:rStyle w:val="Hyperlink"/>
@@ -16640,8 +16935,8 @@
         </w:r>
       </w:hyperlink>
     </w:p>
-    <w:bookmarkEnd w:id="185"/>
-    <w:bookmarkStart w:id="187" w:name="ref-lewandowski2009"/>
+    <w:bookmarkEnd w:id="193"/>
+    <w:bookmarkStart w:id="195" w:name="ref-lewandowski2009"/>
     <w:p>
       <w:pPr>
         <w:pStyle w:val="Bibliography"/>
@@ -16678,7 +16973,7 @@
       <w:r>
         <w:t xml:space="preserve"> </w:t>
       </w:r>
-      <w:hyperlink r:id="rId186">
+      <w:hyperlink r:id="rId194">
         <w:r>
           <w:rPr>
             <w:rStyle w:val="Hyperlink"/>
@@ -16687,8 +16982,8 @@
         </w:r>
       </w:hyperlink>
     </w:p>
-    <w:bookmarkEnd w:id="187"/>
-    <w:bookmarkStart w:id="189" w:name="ref-li2014"/>
+    <w:bookmarkEnd w:id="195"/>
+    <w:bookmarkStart w:id="197" w:name="ref-li2014"/>
     <w:p>
       <w:pPr>
         <w:pStyle w:val="Bibliography"/>
@@ -16725,7 +17020,7 @@
       <w:r>
         <w:t xml:space="preserve"> </w:t>
       </w:r>
-      <w:hyperlink r:id="rId188">
+      <w:hyperlink r:id="rId196">
         <w:r>
           <w:rPr>
             <w:rStyle w:val="Hyperlink"/>
@@ -16734,8 +17029,8 @@
         </w:r>
       </w:hyperlink>
     </w:p>
-    <w:bookmarkEnd w:id="189"/>
-    <w:bookmarkStart w:id="191" w:name="ref-lhq3"/>
+    <w:bookmarkEnd w:id="197"/>
+    <w:bookmarkStart w:id="199" w:name="ref-lhq3"/>
     <w:p>
       <w:pPr>
         <w:pStyle w:val="Bibliography"/>
@@ -16790,7 +17085,7 @@
       <w:r>
         <w:t xml:space="preserve"> </w:t>
       </w:r>
-      <w:hyperlink r:id="rId190">
+      <w:hyperlink r:id="rId198">
         <w:r>
           <w:rPr>
             <w:rStyle w:val="Hyperlink"/>
@@ -16799,8 +17094,8 @@
         </w:r>
       </w:hyperlink>
     </w:p>
-    <w:bookmarkEnd w:id="191"/>
-    <w:bookmarkStart w:id="193" w:name="ref-li2015"/>
+    <w:bookmarkEnd w:id="199"/>
+    <w:bookmarkStart w:id="201" w:name="ref-li2015"/>
     <w:p>
       <w:pPr>
         <w:pStyle w:val="Bibliography"/>
@@ -16837,7 +17132,7 @@
       <w:r>
         <w:t xml:space="preserve"> </w:t>
       </w:r>
-      <w:hyperlink r:id="rId192">
+      <w:hyperlink r:id="rId200">
         <w:r>
           <w:rPr>
             <w:rStyle w:val="Hyperlink"/>
@@ -16846,8 +17141,8 @@
         </w:r>
       </w:hyperlink>
     </w:p>
-    <w:bookmarkEnd w:id="193"/>
-    <w:bookmarkStart w:id="195" w:name="ref-linck2014"/>
+    <w:bookmarkEnd w:id="201"/>
+    <w:bookmarkStart w:id="203" w:name="ref-linck2014"/>
     <w:p>
       <w:pPr>
         <w:pStyle w:val="Bibliography"/>
@@ -16884,7 +17179,7 @@
       <w:r>
         <w:t xml:space="preserve"> </w:t>
       </w:r>
-      <w:hyperlink r:id="rId194">
+      <w:hyperlink r:id="rId202">
         <w:r>
           <w:rPr>
             <w:rStyle w:val="Hyperlink"/>
@@ -16893,8 +17188,8 @@
         </w:r>
       </w:hyperlink>
     </w:p>
-    <w:bookmarkEnd w:id="195"/>
-    <w:bookmarkStart w:id="197" w:name="ref-linckweiss2015"/>
+    <w:bookmarkEnd w:id="203"/>
+    <w:bookmarkStart w:id="205" w:name="ref-linckweiss2015"/>
     <w:p>
       <w:pPr>
         <w:pStyle w:val="Bibliography"/>
@@ -16931,7 +17226,7 @@
       <w:r>
         <w:t xml:space="preserve"> </w:t>
       </w:r>
-      <w:hyperlink r:id="rId196">
+      <w:hyperlink r:id="rId204">
         <w:r>
           <w:rPr>
             <w:rStyle w:val="Hyperlink"/>
@@ -16940,8 +17235,8 @@
         </w:r>
       </w:hyperlink>
     </w:p>
-    <w:bookmarkEnd w:id="197"/>
-    <w:bookmarkStart w:id="199" w:name="ref-makowski2019"/>
+    <w:bookmarkEnd w:id="205"/>
+    <w:bookmarkStart w:id="207" w:name="ref-makowski2019"/>
     <w:p>
       <w:pPr>
         <w:pStyle w:val="Bibliography"/>
@@ -16990,7 +17285,7 @@
       <w:r>
         <w:t xml:space="preserve"> </w:t>
       </w:r>
-      <w:hyperlink r:id="rId198">
+      <w:hyperlink r:id="rId206">
         <w:r>
           <w:rPr>
             <w:rStyle w:val="Hyperlink"/>
@@ -16999,8 +17294,8 @@
         </w:r>
       </w:hyperlink>
     </w:p>
-    <w:bookmarkEnd w:id="199"/>
-    <w:bookmarkStart w:id="201" w:name="ref-martensson2012"/>
+    <w:bookmarkEnd w:id="207"/>
+    <w:bookmarkStart w:id="209" w:name="ref-martensson2012"/>
     <w:p>
       <w:pPr>
         <w:pStyle w:val="Bibliography"/>
@@ -17037,7 +17332,7 @@
       <w:r>
         <w:t xml:space="preserve"> </w:t>
       </w:r>
-      <w:hyperlink r:id="rId200">
+      <w:hyperlink r:id="rId208">
         <w:r>
           <w:rPr>
             <w:rStyle w:val="Hyperlink"/>
@@ -17046,8 +17341,8 @@
         </w:r>
       </w:hyperlink>
     </w:p>
-    <w:bookmarkEnd w:id="201"/>
-    <w:bookmarkStart w:id="203" w:name="ref-marwick2018"/>
+    <w:bookmarkEnd w:id="209"/>
+    <w:bookmarkStart w:id="211" w:name="ref-marwick2018"/>
     <w:p>
       <w:pPr>
         <w:pStyle w:val="Bibliography"/>
@@ -17096,7 +17391,7 @@
       <w:r>
         <w:t xml:space="preserve"> </w:t>
       </w:r>
-      <w:hyperlink r:id="rId202">
+      <w:hyperlink r:id="rId210">
         <w:r>
           <w:rPr>
             <w:rStyle w:val="Hyperlink"/>
@@ -17105,8 +17400,8 @@
         </w:r>
       </w:hyperlink>
     </w:p>
-    <w:bookmarkEnd w:id="203"/>
-    <w:bookmarkStart w:id="205" w:name="ref-mclatchie2025"/>
+    <w:bookmarkEnd w:id="211"/>
+    <w:bookmarkStart w:id="213" w:name="ref-mclatchie2025"/>
     <w:p>
       <w:pPr>
         <w:pStyle w:val="Bibliography"/>
@@ -17143,7 +17438,7 @@
       <w:r>
         <w:t xml:space="preserve"> </w:t>
       </w:r>
-      <w:hyperlink r:id="rId204">
+      <w:hyperlink r:id="rId212">
         <w:r>
           <w:rPr>
             <w:rStyle w:val="Hyperlink"/>
@@ -17152,8 +17447,8 @@
         </w:r>
       </w:hyperlink>
     </w:p>
-    <w:bookmarkEnd w:id="205"/>
-    <w:bookmarkStart w:id="207" w:name="ref-misyak2012"/>
+    <w:bookmarkEnd w:id="213"/>
+    <w:bookmarkStart w:id="215" w:name="ref-misyak2012"/>
     <w:p>
       <w:pPr>
         <w:pStyle w:val="Bibliography"/>
@@ -17190,7 +17485,7 @@
       <w:r>
         <w:t xml:space="preserve"> </w:t>
       </w:r>
-      <w:hyperlink r:id="rId206">
+      <w:hyperlink r:id="rId214">
         <w:r>
           <w:rPr>
             <w:rStyle w:val="Hyperlink"/>
@@ -17199,8 +17494,8 @@
         </w:r>
       </w:hyperlink>
     </w:p>
-    <w:bookmarkEnd w:id="207"/>
-    <w:bookmarkStart w:id="209" w:name="ref-morganshort2014"/>
+    <w:bookmarkEnd w:id="215"/>
+    <w:bookmarkStart w:id="217" w:name="ref-morganshort2014"/>
     <w:p>
       <w:pPr>
         <w:pStyle w:val="Bibliography"/>
@@ -17237,7 +17532,7 @@
       <w:r>
         <w:t xml:space="preserve"> </w:t>
       </w:r>
-      <w:hyperlink r:id="rId208">
+      <w:hyperlink r:id="rId216">
         <w:r>
           <w:rPr>
             <w:rStyle w:val="Hyperlink"/>
@@ -17246,8 +17541,8 @@
         </w:r>
       </w:hyperlink>
     </w:p>
-    <w:bookmarkEnd w:id="209"/>
-    <w:bookmarkStart w:id="211" w:name="ref-murre2011"/>
+    <w:bookmarkEnd w:id="217"/>
+    <w:bookmarkStart w:id="219" w:name="ref-murre2011"/>
     <w:p>
       <w:pPr>
         <w:pStyle w:val="Bibliography"/>
@@ -17284,7 +17579,7 @@
       <w:r>
         <w:t xml:space="preserve"> </w:t>
       </w:r>
-      <w:hyperlink r:id="rId210">
+      <w:hyperlink r:id="rId218">
         <w:r>
           <w:rPr>
             <w:rStyle w:val="Hyperlink"/>
@@ -17293,8 +17588,8 @@
         </w:r>
       </w:hyperlink>
     </w:p>
-    <w:bookmarkEnd w:id="211"/>
-    <w:bookmarkStart w:id="213" w:name="ref-nissen1987"/>
+    <w:bookmarkEnd w:id="219"/>
+    <w:bookmarkStart w:id="221" w:name="ref-nissen1987"/>
     <w:p>
       <w:pPr>
         <w:pStyle w:val="Bibliography"/>
@@ -17331,7 +17626,7 @@
       <w:r>
         <w:t xml:space="preserve"> </w:t>
       </w:r>
-      <w:hyperlink r:id="rId212">
+      <w:hyperlink r:id="rId220">
         <w:r>
           <w:rPr>
             <w:rStyle w:val="Hyperlink"/>
@@ -17340,8 +17635,8 @@
         </w:r>
       </w:hyperlink>
     </w:p>
-    <w:bookmarkEnd w:id="213"/>
-    <w:bookmarkStart w:id="215" w:name="ref-nosek2018"/>
+    <w:bookmarkEnd w:id="221"/>
+    <w:bookmarkStart w:id="223" w:name="ref-nosek2018"/>
     <w:p>
       <w:pPr>
         <w:pStyle w:val="Bibliography"/>
@@ -17378,7 +17673,7 @@
       <w:r>
         <w:t xml:space="preserve"> </w:t>
       </w:r>
-      <w:hyperlink r:id="rId214">
+      <w:hyperlink r:id="rId222">
         <w:r>
           <w:rPr>
             <w:rStyle w:val="Hyperlink"/>
@@ -17387,8 +17682,8 @@
         </w:r>
       </w:hyperlink>
     </w:p>
-    <w:bookmarkEnd w:id="215"/>
-    <w:bookmarkStart w:id="217" w:name="ref-ociepka2022"/>
+    <w:bookmarkEnd w:id="223"/>
+    <w:bookmarkStart w:id="225" w:name="ref-ociepka2022"/>
     <w:p>
       <w:pPr>
         <w:pStyle w:val="Bibliography"/>
@@ -17425,7 +17720,7 @@
       <w:r>
         <w:t xml:space="preserve"> </w:t>
       </w:r>
-      <w:hyperlink r:id="rId216">
+      <w:hyperlink r:id="rId224">
         <w:r>
           <w:rPr>
             <w:rStyle w:val="Hyperlink"/>
@@ -17434,8 +17729,8 @@
         </w:r>
       </w:hyperlink>
     </w:p>
-    <w:bookmarkEnd w:id="217"/>
-    <w:bookmarkStart w:id="219" w:name="ref-oliveira2023"/>
+    <w:bookmarkEnd w:id="225"/>
+    <w:bookmarkStart w:id="227" w:name="ref-oliveira2023"/>
     <w:p>
       <w:pPr>
         <w:pStyle w:val="Bibliography"/>
@@ -17472,7 +17767,7 @@
       <w:r>
         <w:t xml:space="preserve"> </w:t>
       </w:r>
-      <w:hyperlink r:id="rId218">
+      <w:hyperlink r:id="rId226">
         <w:r>
           <w:rPr>
             <w:rStyle w:val="Hyperlink"/>
@@ -17481,8 +17776,8 @@
         </w:r>
       </w:hyperlink>
     </w:p>
-    <w:bookmarkEnd w:id="219"/>
-    <w:bookmarkStart w:id="221" w:name="ref-ouyang2020"/>
+    <w:bookmarkEnd w:id="227"/>
+    <w:bookmarkStart w:id="229" w:name="ref-ouyang2020"/>
     <w:p>
       <w:pPr>
         <w:pStyle w:val="Bibliography"/>
@@ -17519,7 +17814,7 @@
       <w:r>
         <w:t xml:space="preserve"> </w:t>
       </w:r>
-      <w:hyperlink r:id="rId220">
+      <w:hyperlink r:id="rId228">
         <w:r>
           <w:rPr>
             <w:rStyle w:val="Hyperlink"/>
@@ -17528,8 +17823,8 @@
         </w:r>
       </w:hyperlink>
     </w:p>
-    <w:bookmarkEnd w:id="221"/>
-    <w:bookmarkStart w:id="223" w:name="ref-paap2013"/>
+    <w:bookmarkEnd w:id="229"/>
+    <w:bookmarkStart w:id="231" w:name="ref-paap2013"/>
     <w:p>
       <w:pPr>
         <w:pStyle w:val="Bibliography"/>
@@ -17566,7 +17861,7 @@
       <w:r>
         <w:t xml:space="preserve"> </w:t>
       </w:r>
-      <w:hyperlink r:id="rId222">
+      <w:hyperlink r:id="rId230">
         <w:r>
           <w:rPr>
             <w:rStyle w:val="Hyperlink"/>
@@ -17575,8 +17870,8 @@
         </w:r>
       </w:hyperlink>
     </w:p>
-    <w:bookmarkEnd w:id="223"/>
-    <w:bookmarkStart w:id="225" w:name="ref-piironen2020"/>
+    <w:bookmarkEnd w:id="231"/>
+    <w:bookmarkStart w:id="233" w:name="ref-piironen2020"/>
     <w:p>
       <w:pPr>
         <w:pStyle w:val="Bibliography"/>
@@ -17613,7 +17908,7 @@
       <w:r>
         <w:t xml:space="preserve"> </w:t>
       </w:r>
-      <w:hyperlink r:id="rId224">
+      <w:hyperlink r:id="rId232">
         <w:r>
           <w:rPr>
             <w:rStyle w:val="Hyperlink"/>
@@ -17622,8 +17917,8 @@
         </w:r>
       </w:hyperlink>
     </w:p>
-    <w:bookmarkEnd w:id="225"/>
-    <w:bookmarkStart w:id="227" w:name="ref-piironen2017"/>
+    <w:bookmarkEnd w:id="233"/>
+    <w:bookmarkStart w:id="235" w:name="ref-piironen2017"/>
     <w:p>
       <w:pPr>
         <w:pStyle w:val="Bibliography"/>
@@ -17672,7 +17967,7 @@
       <w:r>
         <w:t xml:space="preserve"> </w:t>
       </w:r>
-      <w:hyperlink r:id="rId226">
+      <w:hyperlink r:id="rId234">
         <w:r>
           <w:rPr>
             <w:rStyle w:val="Hyperlink"/>
@@ -17681,8 +17976,8 @@
         </w:r>
       </w:hyperlink>
     </w:p>
-    <w:bookmarkEnd w:id="227"/>
-    <w:bookmarkStart w:id="229" w:name="ref-prat2020"/>
+    <w:bookmarkEnd w:id="235"/>
+    <w:bookmarkStart w:id="237" w:name="ref-prat2020"/>
     <w:p>
       <w:pPr>
         <w:pStyle w:val="Bibliography"/>
@@ -17719,7 +18014,7 @@
       <w:r>
         <w:t xml:space="preserve"> </w:t>
       </w:r>
-      <w:hyperlink r:id="rId228">
+      <w:hyperlink r:id="rId236">
         <w:r>
           <w:rPr>
             <w:rStyle w:val="Hyperlink"/>
@@ -17728,8 +18023,8 @@
         </w:r>
       </w:hyperlink>
     </w:p>
-    <w:bookmarkEnd w:id="229"/>
-    <w:bookmarkStart w:id="231" w:name="ref-prat2016"/>
+    <w:bookmarkEnd w:id="237"/>
+    <w:bookmarkStart w:id="239" w:name="ref-prat2016"/>
     <w:p>
       <w:pPr>
         <w:pStyle w:val="Bibliography"/>
@@ -17778,7 +18073,7 @@
       <w:r>
         <w:t xml:space="preserve"> </w:t>
       </w:r>
-      <w:hyperlink r:id="rId230">
+      <w:hyperlink r:id="rId238">
         <w:r>
           <w:rPr>
             <w:rStyle w:val="Hyperlink"/>
@@ -17787,8 +18082,8 @@
         </w:r>
       </w:hyperlink>
     </w:p>
-    <w:bookmarkEnd w:id="231"/>
-    <w:bookmarkStart w:id="233" w:name="ref-prat2019"/>
+    <w:bookmarkEnd w:id="239"/>
+    <w:bookmarkStart w:id="241" w:name="ref-prat2019"/>
     <w:p>
       <w:pPr>
         <w:pStyle w:val="Bibliography"/>
@@ -17825,7 +18120,7 @@
       <w:r>
         <w:t xml:space="preserve"> </w:t>
       </w:r>
-      <w:hyperlink r:id="rId232">
+      <w:hyperlink r:id="rId240">
         <w:r>
           <w:rPr>
             <w:rStyle w:val="Hyperlink"/>
@@ -17834,8 +18129,8 @@
         </w:r>
       </w:hyperlink>
     </w:p>
-    <w:bookmarkEnd w:id="233"/>
-    <w:bookmarkStart w:id="235" w:name="ref-rcoreteam"/>
+    <w:bookmarkEnd w:id="241"/>
+    <w:bookmarkStart w:id="243" w:name="ref-rcoreteam"/>
     <w:p>
       <w:pPr>
         <w:pStyle w:val="Bibliography"/>
@@ -17859,7 +18154,7 @@
       <w:r>
         <w:t xml:space="preserve"> </w:t>
       </w:r>
-      <w:hyperlink r:id="rId234">
+      <w:hyperlink r:id="rId242">
         <w:r>
           <w:rPr>
             <w:rStyle w:val="Hyperlink"/>
@@ -17868,8 +18163,8 @@
         </w:r>
       </w:hyperlink>
     </w:p>
-    <w:bookmarkEnd w:id="235"/>
-    <w:bookmarkStart w:id="237" w:name="ref-rivera2023"/>
+    <w:bookmarkEnd w:id="243"/>
+    <w:bookmarkStart w:id="245" w:name="ref-rivera2023"/>
     <w:p>
       <w:pPr>
         <w:pStyle w:val="Bibliography"/>
@@ -17906,7 +18201,7 @@
       <w:r>
         <w:t xml:space="preserve"> </w:t>
       </w:r>
-      <w:hyperlink r:id="rId236">
+      <w:hyperlink r:id="rId244">
         <w:r>
           <w:rPr>
             <w:rStyle w:val="Hyperlink"/>
@@ -17915,8 +18210,8 @@
         </w:r>
       </w:hyperlink>
     </w:p>
-    <w:bookmarkEnd w:id="237"/>
-    <w:bookmarkStart w:id="239" w:name="ref-roberts2017"/>
+    <w:bookmarkEnd w:id="245"/>
+    <w:bookmarkStart w:id="247" w:name="ref-roberts2017"/>
     <w:p>
       <w:pPr>
         <w:pStyle w:val="Bibliography"/>
@@ -17953,7 +18248,7 @@
       <w:r>
         <w:t xml:space="preserve"> </w:t>
       </w:r>
-      <w:hyperlink r:id="rId238">
+      <w:hyperlink r:id="rId246">
         <w:r>
           <w:rPr>
             <w:rStyle w:val="Hyperlink"/>
@@ -17962,8 +18257,8 @@
         </w:r>
       </w:hyperlink>
     </w:p>
-    <w:bookmarkEnd w:id="239"/>
-    <w:bookmarkStart w:id="241" w:name="ref-rouderhaaf2019"/>
+    <w:bookmarkEnd w:id="247"/>
+    <w:bookmarkStart w:id="249" w:name="ref-rouderhaaf2019"/>
     <w:p>
       <w:pPr>
         <w:pStyle w:val="Bibliography"/>
@@ -18000,7 +18295,7 @@
       <w:r>
         <w:t xml:space="preserve"> </w:t>
       </w:r>
-      <w:hyperlink r:id="rId240">
+      <w:hyperlink r:id="rId248">
         <w:r>
           <w:rPr>
             <w:rStyle w:val="Hyperlink"/>
@@ -18009,8 +18304,8 @@
         </w:r>
       </w:hyperlink>
     </w:p>
-    <w:bookmarkEnd w:id="241"/>
-    <w:bookmarkStart w:id="243" w:name="ref-rouder2023"/>
+    <w:bookmarkEnd w:id="249"/>
+    <w:bookmarkStart w:id="251" w:name="ref-rouder2023"/>
     <w:p>
       <w:pPr>
         <w:pStyle w:val="Bibliography"/>
@@ -18047,7 +18342,7 @@
       <w:r>
         <w:t xml:space="preserve"> </w:t>
       </w:r>
-      <w:hyperlink r:id="rId242">
+      <w:hyperlink r:id="rId250">
         <w:r>
           <w:rPr>
             <w:rStyle w:val="Hyperlink"/>
@@ -18056,8 +18351,8 @@
         </w:r>
       </w:hyperlink>
     </w:p>
-    <w:bookmarkEnd w:id="243"/>
-    <w:bookmarkStart w:id="245" w:name="ref-rubin2021"/>
+    <w:bookmarkEnd w:id="251"/>
+    <w:bookmarkStart w:id="253" w:name="ref-rubin2021"/>
     <w:p>
       <w:pPr>
         <w:pStyle w:val="Bibliography"/>
@@ -18094,7 +18389,7 @@
       <w:r>
         <w:t xml:space="preserve"> </w:t>
       </w:r>
-      <w:hyperlink r:id="rId244">
+      <w:hyperlink r:id="rId252">
         <w:r>
           <w:rPr>
             <w:rStyle w:val="Hyperlink"/>
@@ -18103,8 +18398,8 @@
         </w:r>
       </w:hyperlink>
     </w:p>
-    <w:bookmarkEnd w:id="245"/>
-    <w:bookmarkStart w:id="247" w:name="ref-schad2021"/>
+    <w:bookmarkEnd w:id="253"/>
+    <w:bookmarkStart w:id="255" w:name="ref-schad2021"/>
     <w:p>
       <w:pPr>
         <w:pStyle w:val="Bibliography"/>
@@ -18153,7 +18448,7 @@
       <w:r>
         <w:t xml:space="preserve"> </w:t>
       </w:r>
-      <w:hyperlink r:id="rId246">
+      <w:hyperlink r:id="rId254">
         <w:r>
           <w:rPr>
             <w:rStyle w:val="Hyperlink"/>
@@ -18162,8 +18457,8 @@
         </w:r>
       </w:hyperlink>
     </w:p>
-    <w:bookmarkEnd w:id="247"/>
-    <w:bookmarkStart w:id="249" w:name="ref-scharfen2018"/>
+    <w:bookmarkEnd w:id="255"/>
+    <w:bookmarkStart w:id="257" w:name="ref-scharfen2018"/>
     <w:p>
       <w:pPr>
         <w:pStyle w:val="Bibliography"/>
@@ -18200,7 +18495,7 @@
       <w:r>
         <w:t xml:space="preserve"> </w:t>
       </w:r>
-      <w:hyperlink r:id="rId248">
+      <w:hyperlink r:id="rId256">
         <w:r>
           <w:rPr>
             <w:rStyle w:val="Hyperlink"/>
@@ -18209,8 +18504,8 @@
         </w:r>
       </w:hyperlink>
     </w:p>
-    <w:bookmarkEnd w:id="249"/>
-    <w:bookmarkStart w:id="251" w:name="ref-schielzeth2010"/>
+    <w:bookmarkEnd w:id="257"/>
+    <w:bookmarkStart w:id="259" w:name="ref-schielzeth2010"/>
     <w:p>
       <w:pPr>
         <w:pStyle w:val="Bibliography"/>
@@ -18247,7 +18542,7 @@
       <w:r>
         <w:t xml:space="preserve"> </w:t>
       </w:r>
-      <w:hyperlink r:id="rId250">
+      <w:hyperlink r:id="rId258">
         <w:r>
           <w:rPr>
             <w:rStyle w:val="Hyperlink"/>
@@ -18256,8 +18551,8 @@
         </w:r>
       </w:hyperlink>
     </w:p>
-    <w:bookmarkEnd w:id="251"/>
-    <w:bookmarkStart w:id="252" w:name="ref-shadish2002"/>
+    <w:bookmarkEnd w:id="259"/>
+    <w:bookmarkStart w:id="260" w:name="ref-shadish2002"/>
     <w:p>
       <w:pPr>
         <w:pStyle w:val="Bibliography"/>
@@ -18279,8 +18574,8 @@
         <w:t xml:space="preserve">. Houghton Mifflin.</w:t>
       </w:r>
     </w:p>
-    <w:bookmarkEnd w:id="252"/>
-    <w:bookmarkStart w:id="254" w:name="ref-simons2016"/>
+    <w:bookmarkEnd w:id="260"/>
+    <w:bookmarkStart w:id="262" w:name="ref-simons2016"/>
     <w:p>
       <w:pPr>
         <w:pStyle w:val="Bibliography"/>
@@ -18329,7 +18624,7 @@
       <w:r>
         <w:t xml:space="preserve"> </w:t>
       </w:r>
-      <w:hyperlink r:id="rId253">
+      <w:hyperlink r:id="rId261">
         <w:r>
           <w:rPr>
             <w:rStyle w:val="Hyperlink"/>
@@ -18338,8 +18633,8 @@
         </w:r>
       </w:hyperlink>
     </w:p>
-    <w:bookmarkEnd w:id="254"/>
-    <w:bookmarkStart w:id="256" w:name="ref-soskuthy2017"/>
+    <w:bookmarkEnd w:id="262"/>
+    <w:bookmarkStart w:id="264" w:name="ref-soskuthy2017"/>
     <w:p>
       <w:pPr>
         <w:pStyle w:val="Bibliography"/>
@@ -18363,7 +18658,7 @@
       <w:r>
         <w:t xml:space="preserve"> </w:t>
       </w:r>
-      <w:hyperlink r:id="rId255">
+      <w:hyperlink r:id="rId263">
         <w:r>
           <w:rPr>
             <w:rStyle w:val="Hyperlink"/>
@@ -18372,8 +18667,8 @@
         </w:r>
       </w:hyperlink>
     </w:p>
-    <w:bookmarkEnd w:id="256"/>
-    <w:bookmarkStart w:id="258" w:name="ref-stroop1935"/>
+    <w:bookmarkEnd w:id="264"/>
+    <w:bookmarkStart w:id="266" w:name="ref-stroop1935"/>
     <w:p>
       <w:pPr>
         <w:pStyle w:val="Bibliography"/>
@@ -18410,7 +18705,7 @@
       <w:r>
         <w:t xml:space="preserve"> </w:t>
       </w:r>
-      <w:hyperlink r:id="rId257">
+      <w:hyperlink r:id="rId265">
         <w:r>
           <w:rPr>
             <w:rStyle w:val="Hyperlink"/>
@@ -18419,8 +18714,8 @@
         </w:r>
       </w:hyperlink>
     </w:p>
-    <w:bookmarkEnd w:id="258"/>
-    <w:bookmarkStart w:id="260" w:name="ref-vehtari2017"/>
+    <w:bookmarkEnd w:id="266"/>
+    <w:bookmarkStart w:id="268" w:name="ref-vehtari2017"/>
     <w:p>
       <w:pPr>
         <w:pStyle w:val="Bibliography"/>
@@ -18478,7 +18773,7 @@
       <w:r>
         <w:t xml:space="preserve"> </w:t>
       </w:r>
-      <w:hyperlink r:id="rId259">
+      <w:hyperlink r:id="rId267">
         <w:r>
           <w:rPr>
             <w:rStyle w:val="Hyperlink"/>
@@ -18487,8 +18782,8 @@
         </w:r>
       </w:hyperlink>
     </w:p>
-    <w:bookmarkEnd w:id="260"/>
-    <w:bookmarkStart w:id="262" w:name="ref-vehtari2021"/>
+    <w:bookmarkEnd w:id="268"/>
+    <w:bookmarkStart w:id="270" w:name="ref-vehtari2021"/>
     <w:p>
       <w:pPr>
         <w:pStyle w:val="Bibliography"/>
@@ -18558,7 +18853,7 @@
       <w:r>
         <w:t xml:space="preserve"> </w:t>
       </w:r>
-      <w:hyperlink r:id="rId261">
+      <w:hyperlink r:id="rId269">
         <w:r>
           <w:rPr>
             <w:rStyle w:val="Hyperlink"/>
@@ -18567,8 +18862,8 @@
         </w:r>
       </w:hyperlink>
     </w:p>
-    <w:bookmarkEnd w:id="262"/>
-    <w:bookmarkStart w:id="264" w:name="ref-voytek2015"/>
+    <w:bookmarkEnd w:id="270"/>
+    <w:bookmarkStart w:id="272" w:name="ref-voytek2015"/>
     <w:p>
       <w:pPr>
         <w:pStyle w:val="Bibliography"/>
@@ -18605,7 +18900,7 @@
       <w:r>
         <w:t xml:space="preserve"> </w:t>
       </w:r>
-      <w:hyperlink r:id="rId263">
+      <w:hyperlink r:id="rId271">
         <w:r>
           <w:rPr>
             <w:rStyle w:val="Hyperlink"/>
@@ -18614,8 +18909,8 @@
         </w:r>
       </w:hyperlink>
     </w:p>
-    <w:bookmarkEnd w:id="264"/>
-    <w:bookmarkStart w:id="266" w:name="ref-wagenmakers2012"/>
+    <w:bookmarkEnd w:id="272"/>
+    <w:bookmarkStart w:id="274" w:name="ref-wagenmakers2012"/>
     <w:p>
       <w:pPr>
         <w:pStyle w:val="Bibliography"/>
@@ -18652,7 +18947,7 @@
       <w:r>
         <w:t xml:space="preserve"> </w:t>
       </w:r>
-      <w:hyperlink r:id="rId265">
+      <w:hyperlink r:id="rId273">
         <w:r>
           <w:rPr>
             <w:rStyle w:val="Hyperlink"/>
@@ -18661,8 +18956,8 @@
         </w:r>
       </w:hyperlink>
     </w:p>
-    <w:bookmarkEnd w:id="266"/>
-    <w:bookmarkStart w:id="268" w:name="ref-welch1967"/>
+    <w:bookmarkEnd w:id="274"/>
+    <w:bookmarkStart w:id="276" w:name="ref-welch1967"/>
     <w:p>
       <w:pPr>
         <w:pStyle w:val="Bibliography"/>
@@ -18711,7 +19006,7 @@
       <w:r>
         <w:t xml:space="preserve"> </w:t>
       </w:r>
-      <w:hyperlink r:id="rId267">
+      <w:hyperlink r:id="rId275">
         <w:r>
           <w:rPr>
             <w:rStyle w:val="Hyperlink"/>
@@ -18720,8 +19015,8 @@
         </w:r>
       </w:hyperlink>
     </w:p>
-    <w:bookmarkEnd w:id="268"/>
-    <w:bookmarkStart w:id="270" w:name="ref-winterwieling2016"/>
+    <w:bookmarkEnd w:id="276"/>
+    <w:bookmarkStart w:id="278" w:name="ref-winterwieling2016"/>
     <w:p>
       <w:pPr>
         <w:pStyle w:val="Bibliography"/>
@@ -18758,7 +19053,7 @@
       <w:r>
         <w:t xml:space="preserve"> </w:t>
       </w:r>
-      <w:hyperlink r:id="rId269">
+      <w:hyperlink r:id="rId277">
         <w:r>
           <w:rPr>
             <w:rStyle w:val="Hyperlink"/>
@@ -18767,8 +19062,8 @@
         </w:r>
       </w:hyperlink>
     </w:p>
-    <w:bookmarkEnd w:id="270"/>
-    <w:bookmarkStart w:id="272" w:name="ref-zhou2024"/>
+    <w:bookmarkEnd w:id="278"/>
+    <w:bookmarkStart w:id="280" w:name="ref-zhou2024"/>
     <w:p>
       <w:pPr>
         <w:pStyle w:val="Bibliography"/>
@@ -18819,7 +19114,7 @@
       <w:r>
         <w:t xml:space="preserve"> </w:t>
       </w:r>
-      <w:hyperlink r:id="rId271">
+      <w:hyperlink r:id="rId279">
         <w:r>
           <w:rPr>
             <w:rStyle w:val="Hyperlink"/>
@@ -18828,8 +19123,8 @@
         </w:r>
       </w:hyperlink>
     </w:p>
-    <w:bookmarkEnd w:id="272"/>
-    <w:bookmarkEnd w:id="273"/>
+    <w:bookmarkEnd w:id="280"/>
+    <w:bookmarkEnd w:id="281"/>
     <w:p>
       <w:pPr>
         <w:pStyle w:val="Heading1"/>
@@ -18838,7 +19133,7 @@
         <w:t xml:space="preserve">Appendix A</w:t>
       </w:r>
     </w:p>
-    <w:bookmarkStart w:id="275" w:name="apx-convergence-diagnostics-p2"/>
+    <w:bookmarkStart w:id="283" w:name="apx-convergence-diagnostics-p2"/>
     <w:p>
       <w:pPr>
         <w:pStyle w:val="Heading1"/>
@@ -18872,7 +19167,7 @@
         <w:t xml:space="preserve">gives the realised per-model values behind the summary in the Results. The common-sample refits behind the cross-validation comparisons are not listed. They exist only to score the two parameterisations on identical observations, carry no reported coefficient and do not pass through the diagnostic artefact.</w:t>
       </w:r>
     </w:p>
-    <w:bookmarkStart w:id="274" w:name="tbl-convergence"/>
+    <w:bookmarkStart w:id="282" w:name="tbl-convergence"/>
     <w:p>
       <w:pPr>
         <w:pStyle w:val="FigureTitle"/>
@@ -19571,7 +19866,7 @@
         </w:tc>
       </w:tr>
     </w:tbl>
-    <w:bookmarkEnd w:id="274"/>
+    <w:bookmarkEnd w:id="282"/>
     <w:p>
       <w:pPr>
         <w:pStyle w:val="FigureNote"/>
@@ -19613,7 +19908,7 @@
         <w:br w:type="page"/>
       </w:r>
     </w:p>
-    <w:bookmarkEnd w:id="275"/>
+    <w:bookmarkEnd w:id="283"/>
     <w:p>
       <w:pPr>
         <w:pStyle w:val="Heading1"/>
@@ -19622,7 +19917,7 @@
         <w:t xml:space="preserve">Appendix B</w:t>
       </w:r>
     </w:p>
-    <w:bookmarkStart w:id="277" w:name="apx-predictor-reliability"/>
+    <w:bookmarkStart w:id="285" w:name="apx-predictor-reliability"/>
     <w:p>
       <w:pPr>
         <w:pStyle w:val="Heading1"/>
@@ -19675,7 +19970,7 @@
         <w:t xml:space="preserve">.</w:t>
       </w:r>
     </w:p>
-    <w:bookmarkStart w:id="276" w:name="tbl-predictor-reliability"/>
+    <w:bookmarkStart w:id="284" w:name="tbl-predictor-reliability"/>
     <w:p>
       <w:pPr>
         <w:pStyle w:val="FigureTitle"/>
@@ -19917,7 +20212,7 @@
         </w:tc>
       </w:tr>
     </w:tbl>
-    <w:bookmarkEnd w:id="276"/>
+    <w:bookmarkEnd w:id="284"/>
     <w:p>
       <w:pPr>
         <w:pStyle w:val="FigureNote"/>
@@ -19933,7 +20228,7 @@
         <w:t xml:space="preserve">. Reliability is estimated by permutation split-half: each participant’s trials are repeatedly split in half, the index is recomputed on each half, the halves are correlated across participants, and the mean correlation is corrected to full test length by the Spearman–Brown formula. Each index was split the number of times given in the text. Two of the three indices (Stroop interference, ASRT learning) are difference scores.</w:t>
       </w:r>
     </w:p>
-    <w:bookmarkEnd w:id="277"/>
+    <w:bookmarkEnd w:id="285"/>
     <w:sectPr>
       <w:headerReference r:id="rId8" w:type="even"/>
       <w:headerReference r:id="rId9" w:type="default"/>

</xml_diff>